<commit_message>
Add mor hyperlink impl
</commit_message>
<xml_diff>
--- a/tests/examples/content_check.docx
+++ b/tests/examples/content_check.docx
@@ -172,6 +172,7 @@
           <w:vertAlign w:val="superscript"/>
         </w:rPr>
       </w:pPr>
+      <w:proofErr w:type="spellStart"/>
       <w:r>
         <w:rPr>
           <w:b/>
@@ -198,6 +199,7 @@
         </w:rPr>
         <w:t>ексно</w:t>
       </w:r>
+      <w:proofErr w:type="spellEnd"/>
     </w:p>
     <w:p>
       <w:pPr>
@@ -349,8 +351,101 @@
         <w:t>:</w:t>
       </w:r>
       <w:r>
-        <w:t xml:space="preserve"> заполнитель заполнитель заполнитель заполнитель заполнитель заполнитель заполнитель заполнитель заполнитель заполнитель заполнитель заполнитель заполнитель</w:t>
-      </w:r>
+        <w:t xml:space="preserve"> заполнитель </w:t>
+      </w:r>
+      <w:proofErr w:type="spellStart"/>
+      <w:r>
+        <w:t>заполнитель</w:t>
+      </w:r>
+      <w:proofErr w:type="spellEnd"/>
+      <w:r>
+        <w:t xml:space="preserve"> </w:t>
+      </w:r>
+      <w:proofErr w:type="spellStart"/>
+      <w:r>
+        <w:t>заполнитель</w:t>
+      </w:r>
+      <w:proofErr w:type="spellEnd"/>
+      <w:r>
+        <w:t xml:space="preserve"> </w:t>
+      </w:r>
+      <w:proofErr w:type="spellStart"/>
+      <w:r>
+        <w:t>заполнитель</w:t>
+      </w:r>
+      <w:proofErr w:type="spellEnd"/>
+      <w:r>
+        <w:t xml:space="preserve"> </w:t>
+      </w:r>
+      <w:proofErr w:type="spellStart"/>
+      <w:r>
+        <w:t>заполнитель</w:t>
+      </w:r>
+      <w:proofErr w:type="spellEnd"/>
+      <w:r>
+        <w:t xml:space="preserve"> </w:t>
+      </w:r>
+      <w:proofErr w:type="spellStart"/>
+      <w:r>
+        <w:t>заполнитель</w:t>
+      </w:r>
+      <w:proofErr w:type="spellEnd"/>
+      <w:r>
+        <w:t xml:space="preserve"> </w:t>
+      </w:r>
+      <w:proofErr w:type="spellStart"/>
+      <w:r>
+        <w:t>заполнитель</w:t>
+      </w:r>
+      <w:proofErr w:type="spellEnd"/>
+      <w:r>
+        <w:t xml:space="preserve"> </w:t>
+      </w:r>
+      <w:proofErr w:type="spellStart"/>
+      <w:r>
+        <w:t>заполнитель</w:t>
+      </w:r>
+      <w:proofErr w:type="spellEnd"/>
+      <w:r>
+        <w:t xml:space="preserve"> </w:t>
+      </w:r>
+      <w:proofErr w:type="spellStart"/>
+      <w:r>
+        <w:t>заполнитель</w:t>
+      </w:r>
+      <w:proofErr w:type="spellEnd"/>
+      <w:r>
+        <w:t xml:space="preserve"> </w:t>
+      </w:r>
+      <w:proofErr w:type="spellStart"/>
+      <w:r>
+        <w:t>заполнитель</w:t>
+      </w:r>
+      <w:proofErr w:type="spellEnd"/>
+      <w:r>
+        <w:t xml:space="preserve"> </w:t>
+      </w:r>
+      <w:proofErr w:type="spellStart"/>
+      <w:r>
+        <w:t>заполнитель</w:t>
+      </w:r>
+      <w:proofErr w:type="spellEnd"/>
+      <w:r>
+        <w:t xml:space="preserve"> </w:t>
+      </w:r>
+      <w:proofErr w:type="spellStart"/>
+      <w:r>
+        <w:t>заполнитель</w:t>
+      </w:r>
+      <w:proofErr w:type="spellEnd"/>
+      <w:r>
+        <w:t xml:space="preserve"> </w:t>
+      </w:r>
+      <w:proofErr w:type="spellStart"/>
+      <w:r>
+        <w:t>заполнитель</w:t>
+      </w:r>
+      <w:proofErr w:type="spellEnd"/>
     </w:p>
     <w:p>
       <w:pPr>
@@ -1790,6 +1885,227 @@
     <w:p>
       <w:pPr>
         <w:spacing w:line="259" w:lineRule="auto"/>
+      </w:pPr>
+      <w:r>
+        <w:br w:type="page"/>
+      </w:r>
+    </w:p>
+    <w:p>
+      <w:pPr>
+        <w:pStyle w:val="1"/>
+      </w:pPr>
+      <w:r>
+        <w:lastRenderedPageBreak/>
+        <w:t>Гиперссылка</w:t>
+      </w:r>
+    </w:p>
+    <w:p>
+      <w:pPr>
+        <w:pStyle w:val="2"/>
+      </w:pPr>
+      <w:r>
+        <w:t>Ссылка на веб-страницу</w:t>
+      </w:r>
+    </w:p>
+    <w:p>
+      <w:pPr>
+        <w:spacing w:line="259" w:lineRule="auto"/>
+      </w:pPr>
+      <w:hyperlink r:id="rId6" w:history="1">
+        <w:r>
+          <w:rPr>
+            <w:rStyle w:val="af8"/>
+          </w:rPr>
+          <w:t>Я</w:t>
+        </w:r>
+        <w:r>
+          <w:rPr>
+            <w:rStyle w:val="af8"/>
+          </w:rPr>
+          <w:t>н</w:t>
+        </w:r>
+        <w:r>
+          <w:rPr>
+            <w:rStyle w:val="af8"/>
+          </w:rPr>
+          <w:t>декс</w:t>
+        </w:r>
+      </w:hyperlink>
+    </w:p>
+    <w:p>
+      <w:pPr>
+        <w:pStyle w:val="2"/>
+      </w:pPr>
+      <w:r>
+        <w:t xml:space="preserve">Ссылка </w:t>
+      </w:r>
+      <w:r>
+        <w:t>на файл</w:t>
+      </w:r>
+    </w:p>
+    <w:p>
+      <w:pPr>
+        <w:spacing w:line="259" w:lineRule="auto"/>
+      </w:pPr>
+      <w:hyperlink r:id="rId7" w:history="1">
+        <w:proofErr w:type="spellStart"/>
+        <w:r>
+          <w:rPr>
+            <w:rStyle w:val="af8"/>
+            <w:lang w:val="en-US"/>
+          </w:rPr>
+          <w:t>abc</w:t>
+        </w:r>
+        <w:proofErr w:type="spellEnd"/>
+        <w:r>
+          <w:rPr>
+            <w:rStyle w:val="af8"/>
+          </w:rPr>
+          <w:t>.</w:t>
+        </w:r>
+        <w:r>
+          <w:rPr>
+            <w:rStyle w:val="af8"/>
+            <w:lang w:val="en-US"/>
+          </w:rPr>
+          <w:t>docx</w:t>
+        </w:r>
+      </w:hyperlink>
+    </w:p>
+    <w:p>
+      <w:pPr>
+        <w:pStyle w:val="2"/>
+      </w:pPr>
+      <w:r>
+        <w:t>Ссылка на место в документе</w:t>
+      </w:r>
+    </w:p>
+    <w:p>
+      <w:pPr>
+        <w:spacing w:line="259" w:lineRule="auto"/>
+      </w:pPr>
+      <w:hyperlink w:anchor="_Таблица" w:history="1">
+        <w:r>
+          <w:rPr>
+            <w:rStyle w:val="af8"/>
+          </w:rPr>
+          <w:t>Та</w:t>
+        </w:r>
+        <w:r>
+          <w:rPr>
+            <w:rStyle w:val="af8"/>
+          </w:rPr>
+          <w:t>б</w:t>
+        </w:r>
+        <w:r>
+          <w:rPr>
+            <w:rStyle w:val="af8"/>
+          </w:rPr>
+          <w:t>лица</w:t>
+        </w:r>
+      </w:hyperlink>
+    </w:p>
+    <w:p>
+      <w:pPr>
+        <w:pStyle w:val="2"/>
+      </w:pPr>
+      <w:r>
+        <w:t>Ссылка на почту</w:t>
+      </w:r>
+    </w:p>
+    <w:p>
+      <w:pPr>
+        <w:spacing w:line="259" w:lineRule="auto"/>
+      </w:pPr>
+      <w:hyperlink r:id="rId8" w:history="1">
+        <w:r>
+          <w:rPr>
+            <w:rStyle w:val="af8"/>
+          </w:rPr>
+          <w:t>Почт</w:t>
+        </w:r>
+        <w:r>
+          <w:rPr>
+            <w:rStyle w:val="af8"/>
+          </w:rPr>
+          <w:t>а</w:t>
+        </w:r>
+      </w:hyperlink>
+    </w:p>
+    <w:p>
+      <w:pPr>
+        <w:pStyle w:val="2"/>
+      </w:pPr>
+      <w:r>
+        <w:t>Ссылка с подсказкой</w:t>
+      </w:r>
+    </w:p>
+    <w:p>
+      <w:pPr>
+        <w:spacing w:line="259" w:lineRule="auto"/>
+      </w:pPr>
+      <w:hyperlink r:id="rId9" w:tooltip="Поисковая страница Яндекс" w:history="1">
+        <w:r>
+          <w:rPr>
+            <w:rStyle w:val="af8"/>
+          </w:rPr>
+          <w:t>Яндекс</w:t>
+        </w:r>
+      </w:hyperlink>
+    </w:p>
+    <w:p>
+      <w:pPr>
+        <w:pStyle w:val="2"/>
+      </w:pPr>
+      <w:r>
+        <w:t>Ссылка с другой ра</w:t>
+      </w:r>
+      <w:bookmarkStart w:id="0" w:name="_GoBack"/>
+      <w:bookmarkEnd w:id="0"/>
+      <w:r>
+        <w:t>мкой</w:t>
+      </w:r>
+    </w:p>
+    <w:p>
+      <w:pPr>
+        <w:spacing w:line="259" w:lineRule="auto"/>
+      </w:pPr>
+      <w:hyperlink r:id="rId10" w:history="1">
+        <w:r>
+          <w:rPr>
+            <w:rStyle w:val="af8"/>
+          </w:rPr>
+          <w:t>Ян</w:t>
+        </w:r>
+        <w:r>
+          <w:rPr>
+            <w:rStyle w:val="af8"/>
+          </w:rPr>
+          <w:t>д</w:t>
+        </w:r>
+        <w:r>
+          <w:rPr>
+            <w:rStyle w:val="af8"/>
+          </w:rPr>
+          <w:t>е</w:t>
+        </w:r>
+        <w:r>
+          <w:rPr>
+            <w:rStyle w:val="af8"/>
+          </w:rPr>
+          <w:t>к</w:t>
+        </w:r>
+        <w:r>
+          <w:rPr>
+            <w:rStyle w:val="af8"/>
+          </w:rPr>
+          <w:t>с</w:t>
+        </w:r>
+      </w:hyperlink>
+    </w:p>
+    <w:p>
+      <w:pPr>
+        <w:spacing w:line="259" w:lineRule="auto"/>
         <w:rPr>
           <w:rFonts w:asciiTheme="majorHAnsi" w:eastAsiaTheme="majorEastAsia" w:hAnsiTheme="majorHAnsi" w:cstheme="majorBidi"/>
           <w:color w:val="2F5496" w:themeColor="accent1" w:themeShade="BF"/>
@@ -4089,10 +4405,7 @@
           </w:tcPr>
           <w:p>
             <w:r>
-              <w:t>красный снизу</w:t>
-            </w:r>
-            <w:r>
-              <w:t>, золото сверху</w:t>
+              <w:t>красный снизу, золото сверху</w:t>
             </w:r>
           </w:p>
         </w:tc>
@@ -4183,8 +4496,6 @@
             <w:r>
               <w:t>золото справа</w:t>
             </w:r>
-            <w:bookmarkStart w:id="0" w:name="_GoBack"/>
-            <w:bookmarkEnd w:id="0"/>
           </w:p>
         </w:tc>
         <w:tc>
@@ -8654,6 +8965,8 @@
       <w:pPr>
         <w:pStyle w:val="2"/>
       </w:pPr>
+      <w:bookmarkStart w:id="1" w:name="_Таблица"/>
+      <w:bookmarkEnd w:id="1"/>
       <w:r>
         <w:t>Таблица</w:t>
       </w:r>
@@ -9607,7 +9920,7 @@
         <v:path o:extrusionok="f" gradientshapeok="t" o:connecttype="rect"/>
         <o:lock v:ext="edit" aspectratio="t"/>
       </v:shapetype>
-      <v:shape id="_x0000_i1040" type="#_x0000_t75" style="width:331.5pt;height:225.75pt" o:bullet="t">
+      <v:shape id="_x0000_i1032" type="#_x0000_t75" style="width:331.5pt;height:225.75pt" o:bullet="t">
         <v:imagedata r:id="rId1" o:title="Снимок экрана 2023-08-08 135539"/>
       </v:shape>
     </w:pict>
@@ -13098,6 +13411,41 @@
       <w:u w:val="none"/>
     </w:rPr>
   </w:style>
+  <w:style w:type="character" w:styleId="af8">
+    <w:name w:val="Hyperlink"/>
+    <w:basedOn w:val="a1"/>
+    <w:uiPriority w:val="99"/>
+    <w:unhideWhenUsed/>
+    <w:rsid w:val="00071657"/>
+    <w:rPr>
+      <w:color w:val="0563C1" w:themeColor="hyperlink"/>
+      <w:u w:val="single"/>
+    </w:rPr>
+  </w:style>
+  <w:style w:type="character" w:styleId="af9">
+    <w:name w:val="Unresolved Mention"/>
+    <w:basedOn w:val="a1"/>
+    <w:uiPriority w:val="99"/>
+    <w:semiHidden/>
+    <w:unhideWhenUsed/>
+    <w:rsid w:val="00071657"/>
+    <w:rPr>
+      <w:color w:val="605E5C"/>
+      <w:shd w:val="clear" w:color="auto" w:fill="E1DFDD"/>
+    </w:rPr>
+  </w:style>
+  <w:style w:type="character" w:styleId="afa">
+    <w:name w:val="FollowedHyperlink"/>
+    <w:basedOn w:val="a1"/>
+    <w:uiPriority w:val="99"/>
+    <w:semiHidden/>
+    <w:unhideWhenUsed/>
+    <w:rsid w:val="00071657"/>
+    <w:rPr>
+      <w:color w:val="954F72" w:themeColor="followedHyperlink"/>
+      <w:u w:val="single"/>
+    </w:rPr>
+  </w:style>
 </w:styles>
 </file>
 
@@ -13401,7 +13749,7 @@
 </file>
 
 <file path=customXml/itemProps1.xml><?xml version="1.0" encoding="utf-8"?>
-<ds:datastoreItem xmlns:ds="http://schemas.openxmlformats.org/officeDocument/2006/customXml" ds:itemID="{5802909C-5310-4C67-B0E7-1B7753A41CB8}">
+<ds:datastoreItem xmlns:ds="http://schemas.openxmlformats.org/officeDocument/2006/customXml" ds:itemID="{80D939C0-AE78-458C-957F-4FFD21A9E449}">
   <ds:schemaRefs>
     <ds:schemaRef ds:uri="http://schemas.openxmlformats.org/officeDocument/2006/bibliography"/>
   </ds:schemaRefs>

</xml_diff>

<commit_message>
Add hyperlink html builder
</commit_message>
<xml_diff>
--- a/tests/examples/content_check.docx
+++ b/tests/examples/content_check.docx
@@ -464,6 +464,7 @@
         <w:t>Формула</w:t>
       </w:r>
     </w:p>
+    <w:bookmarkStart w:id="0" w:name="Бином_Ньютона"/>
     <w:p>
       <m:oMathPara>
         <m:oMath>
@@ -627,6 +628,7 @@
           </m:nary>
         </m:oMath>
       </m:oMathPara>
+      <w:bookmarkEnd w:id="0"/>
     </w:p>
     <w:p>
       <m:oMathPara>
@@ -1889,6 +1891,8 @@
       <w:r>
         <w:br w:type="page"/>
       </w:r>
+      <w:bookmarkStart w:id="1" w:name="_GoBack"/>
+      <w:bookmarkEnd w:id="1"/>
     </w:p>
     <w:p>
       <w:pPr>
@@ -1982,6 +1986,14 @@
     </w:p>
     <w:p>
       <w:pPr>
+        <w:pStyle w:val="3"/>
+      </w:pPr>
+      <w:r>
+        <w:t>Ссылка на главу</w:t>
+      </w:r>
+    </w:p>
+    <w:p>
+      <w:pPr>
         <w:spacing w:line="259" w:lineRule="auto"/>
       </w:pPr>
       <w:hyperlink w:anchor="_Таблица" w:history="1">
@@ -2007,6 +2019,39 @@
     </w:p>
     <w:p>
       <w:pPr>
+        <w:pStyle w:val="3"/>
+      </w:pPr>
+      <w:r>
+        <w:t>Ссылка на закладку</w:t>
+      </w:r>
+    </w:p>
+    <w:p>
+      <w:pPr>
+        <w:spacing w:line="259" w:lineRule="auto"/>
+      </w:pPr>
+      <w:hyperlink w:anchor="Бином_Ньютона" w:history="1">
+        <w:r>
+          <w:rPr>
+            <w:rStyle w:val="af8"/>
+          </w:rPr>
+          <w:t>Бином Ньют</w:t>
+        </w:r>
+        <w:r>
+          <w:rPr>
+            <w:rStyle w:val="af8"/>
+          </w:rPr>
+          <w:t>о</w:t>
+        </w:r>
+        <w:r>
+          <w:rPr>
+            <w:rStyle w:val="af8"/>
+          </w:rPr>
+          <w:t>на</w:t>
+        </w:r>
+      </w:hyperlink>
+    </w:p>
+    <w:p>
+      <w:pPr>
         <w:pStyle w:val="2"/>
       </w:pPr>
       <w:r>
@@ -2058,12 +2103,7 @@
         <w:pStyle w:val="2"/>
       </w:pPr>
       <w:r>
-        <w:t>Ссылка с другой ра</w:t>
-      </w:r>
-      <w:bookmarkStart w:id="0" w:name="_GoBack"/>
-      <w:bookmarkEnd w:id="0"/>
-      <w:r>
-        <w:t>мкой</w:t>
+        <w:t>Ссылка с другой рамкой</w:t>
       </w:r>
     </w:p>
     <w:p>
@@ -8965,8 +9005,8 @@
       <w:pPr>
         <w:pStyle w:val="2"/>
       </w:pPr>
-      <w:bookmarkStart w:id="1" w:name="_Таблица"/>
-      <w:bookmarkEnd w:id="1"/>
+      <w:bookmarkStart w:id="2" w:name="_Таблица"/>
+      <w:bookmarkEnd w:id="2"/>
       <w:r>
         <w:t>Таблица</w:t>
       </w:r>
@@ -9920,7 +9960,7 @@
         <v:path o:extrusionok="f" gradientshapeok="t" o:connecttype="rect"/>
         <o:lock v:ext="edit" aspectratio="t"/>
       </v:shapetype>
-      <v:shape id="_x0000_i1032" type="#_x0000_t75" style="width:331.5pt;height:225.75pt" o:bullet="t">
+      <v:shape id="_x0000_i1043" type="#_x0000_t75" style="width:331.5pt;height:225.75pt" o:bullet="t">
         <v:imagedata r:id="rId1" o:title="Снимок экрана 2023-08-08 135539"/>
       </v:shape>
     </w:pict>
@@ -13749,7 +13789,7 @@
 </file>
 
 <file path=customXml/itemProps1.xml><?xml version="1.0" encoding="utf-8"?>
-<ds:datastoreItem xmlns:ds="http://schemas.openxmlformats.org/officeDocument/2006/customXml" ds:itemID="{80D939C0-AE78-458C-957F-4FFD21A9E449}">
+<ds:datastoreItem xmlns:ds="http://schemas.openxmlformats.org/officeDocument/2006/customXml" ds:itemID="{3E15A4BE-9325-42DC-B481-7D3B838735F0}">
   <ds:schemaRefs>
     <ds:schemaRef ds:uri="http://schemas.openxmlformats.org/officeDocument/2006/bibliography"/>
   </ds:schemaRefs>

</xml_diff>

<commit_message>
Add symbol transform support
</commit_message>
<xml_diff>
--- a/tests/examples/content_check.docx
+++ b/tests/examples/content_check.docx
@@ -1891,15 +1891,53 @@
       <w:r>
         <w:br w:type="page"/>
       </w:r>
+    </w:p>
+    <w:p>
+      <w:pPr>
+        <w:pStyle w:val="1"/>
+      </w:pPr>
+      <w:r>
+        <w:lastRenderedPageBreak/>
+        <w:t>Символ</w:t>
+      </w:r>
+    </w:p>
+    <w:p>
+      <w:pPr>
+        <w:spacing w:line="259" w:lineRule="auto"/>
+      </w:pPr>
+      <w:r>
+        <w:sym w:font="Symbol" w:char="F0E5"/>
+      </w:r>
+      <w:r>
+        <w:rPr>
+          <w:lang w:val="en-US"/>
+        </w:rPr>
+        <w:t xml:space="preserve"> (</w:t>
+      </w:r>
+      <w:r>
+        <w:t>сигма – символ суммы)</w:t>
+      </w:r>
       <w:bookmarkStart w:id="1" w:name="_GoBack"/>
       <w:bookmarkEnd w:id="1"/>
     </w:p>
     <w:p>
       <w:pPr>
+        <w:spacing w:line="259" w:lineRule="auto"/>
+      </w:pPr>
+      <w:r>
+        <w:br w:type="page"/>
+      </w:r>
+    </w:p>
+    <w:p>
+      <w:pPr>
+        <w:spacing w:line="259" w:lineRule="auto"/>
+      </w:pPr>
+    </w:p>
+    <w:p>
+      <w:pPr>
         <w:pStyle w:val="1"/>
       </w:pPr>
       <w:r>
-        <w:lastRenderedPageBreak/>
         <w:t>Гиперссылка</w:t>
       </w:r>
     </w:p>
@@ -1920,19 +1958,7 @@
           <w:rPr>
             <w:rStyle w:val="af8"/>
           </w:rPr>
-          <w:t>Я</w:t>
-        </w:r>
-        <w:r>
-          <w:rPr>
-            <w:rStyle w:val="af8"/>
-          </w:rPr>
-          <w:t>н</w:t>
-        </w:r>
-        <w:r>
-          <w:rPr>
-            <w:rStyle w:val="af8"/>
-          </w:rPr>
-          <w:t>декс</w:t>
+          <w:t>Яндекс</w:t>
         </w:r>
       </w:hyperlink>
     </w:p>
@@ -2001,19 +2027,7 @@
           <w:rPr>
             <w:rStyle w:val="af8"/>
           </w:rPr>
-          <w:t>Та</w:t>
-        </w:r>
-        <w:r>
-          <w:rPr>
-            <w:rStyle w:val="af8"/>
-          </w:rPr>
-          <w:t>б</w:t>
-        </w:r>
-        <w:r>
-          <w:rPr>
-            <w:rStyle w:val="af8"/>
-          </w:rPr>
-          <w:t>лица</w:t>
+          <w:t>Таблица</w:t>
         </w:r>
       </w:hyperlink>
     </w:p>
@@ -2034,19 +2048,7 @@
           <w:rPr>
             <w:rStyle w:val="af8"/>
           </w:rPr>
-          <w:t>Бином Ньют</w:t>
-        </w:r>
-        <w:r>
-          <w:rPr>
-            <w:rStyle w:val="af8"/>
-          </w:rPr>
-          <w:t>о</w:t>
-        </w:r>
-        <w:r>
-          <w:rPr>
-            <w:rStyle w:val="af8"/>
-          </w:rPr>
-          <w:t>на</w:t>
+          <w:t>Бином Ньютона</w:t>
         </w:r>
       </w:hyperlink>
     </w:p>
@@ -2067,13 +2069,7 @@
           <w:rPr>
             <w:rStyle w:val="af8"/>
           </w:rPr>
-          <w:t>Почт</w:t>
-        </w:r>
-        <w:r>
-          <w:rPr>
-            <w:rStyle w:val="af8"/>
-          </w:rPr>
-          <w:t>а</w:t>
+          <w:t>Почта</w:t>
         </w:r>
       </w:hyperlink>
     </w:p>
@@ -2115,31 +2111,7 @@
           <w:rPr>
             <w:rStyle w:val="af8"/>
           </w:rPr>
-          <w:t>Ян</w:t>
-        </w:r>
-        <w:r>
-          <w:rPr>
-            <w:rStyle w:val="af8"/>
-          </w:rPr>
-          <w:t>д</w:t>
-        </w:r>
-        <w:r>
-          <w:rPr>
-            <w:rStyle w:val="af8"/>
-          </w:rPr>
-          <w:t>е</w:t>
-        </w:r>
-        <w:r>
-          <w:rPr>
-            <w:rStyle w:val="af8"/>
-          </w:rPr>
-          <w:t>к</w:t>
-        </w:r>
-        <w:r>
-          <w:rPr>
-            <w:rStyle w:val="af8"/>
-          </w:rPr>
-          <w:t>с</w:t>
+          <w:t>Яндекс</w:t>
         </w:r>
       </w:hyperlink>
     </w:p>
@@ -9960,7 +9932,7 @@
         <v:path o:extrusionok="f" gradientshapeok="t" o:connecttype="rect"/>
         <o:lock v:ext="edit" aspectratio="t"/>
       </v:shapetype>
-      <v:shape id="_x0000_i1043" type="#_x0000_t75" style="width:331.5pt;height:225.75pt" o:bullet="t">
+      <v:shape id="_x0000_i1028" type="#_x0000_t75" style="width:331.5pt;height:225.75pt" o:bullet="t">
         <v:imagedata r:id="rId1" o:title="Снимок экрана 2023-08-08 135539"/>
       </v:shape>
     </w:pict>
@@ -13789,7 +13761,7 @@
 </file>
 
 <file path=customXml/itemProps1.xml><?xml version="1.0" encoding="utf-8"?>
-<ds:datastoreItem xmlns:ds="http://schemas.openxmlformats.org/officeDocument/2006/customXml" ds:itemID="{3E15A4BE-9325-42DC-B481-7D3B838735F0}">
+<ds:datastoreItem xmlns:ds="http://schemas.openxmlformats.org/officeDocument/2006/customXml" ds:itemID="{76535179-9F9F-4067-B063-F4C957887D84}">
   <ds:schemaRefs>
     <ds:schemaRef ds:uri="http://schemas.openxmlformats.org/officeDocument/2006/bibliography"/>
   </ds:schemaRefs>

</xml_diff>

<commit_message>
Add sym , fix drawing, dix spaces for omath (latex)
</commit_message>
<xml_diff>
--- a/tests/examples/content_check.docx
+++ b/tests/examples/content_check.docx
@@ -462,6 +462,14 @@
       <w:r>
         <w:lastRenderedPageBreak/>
         <w:t>Формула</w:t>
+      </w:r>
+    </w:p>
+    <w:p>
+      <w:pPr>
+        <w:pStyle w:val="2"/>
+      </w:pPr>
+      <w:r>
+        <w:t>Обычная</w:t>
       </w:r>
     </w:p>
     <w:bookmarkStart w:id="0" w:name="Бином_Ньютона"/>
@@ -795,6 +803,8 @@
           </m:sSup>
         </m:oMath>
       </m:oMathPara>
+      <w:bookmarkStart w:id="1" w:name="_GoBack"/>
+      <w:bookmarkEnd w:id="1"/>
     </w:p>
     <w:p>
       <m:oMathPara>
@@ -1683,6 +1693,11 @@
       </m:oMathPara>
     </w:p>
     <w:p>
+      <w:pPr>
+        <w:rPr>
+          <w:rFonts w:eastAsiaTheme="minorEastAsia"/>
+        </w:rPr>
+      </w:pPr>
       <m:oMathPara>
         <m:oMath>
           <m:func>
@@ -1886,6 +1901,288 @@
     </w:p>
     <w:p>
       <w:pPr>
+        <w:pStyle w:val="2"/>
+        <w:rPr>
+          <w:rFonts w:eastAsiaTheme="minorEastAsia"/>
+        </w:rPr>
+      </w:pPr>
+      <w:r>
+        <w:rPr>
+          <w:rFonts w:eastAsiaTheme="minorEastAsia"/>
+        </w:rPr>
+        <w:t>С контентом внутри</w:t>
+      </w:r>
+    </w:p>
+    <w:p>
+      <m:oMathPara>
+        <m:oMath>
+          <m:r>
+            <w:rPr>
+              <w:rFonts w:ascii="Cambria Math" w:hAnsi="Cambria Math"/>
+            </w:rPr>
+            <m:t>Сигма-символ (</m:t>
+          </m:r>
+          <m:r>
+            <w:rPr>
+              <w:rFonts w:ascii="Cambria Math" w:hAnsi="Cambria Math"/>
+              <w:i/>
+            </w:rPr>
+            <w:sym w:font="Symbol" w:char="F0E5"/>
+          </m:r>
+          <m:r>
+            <w:rPr>
+              <w:rFonts w:ascii="Cambria Math" w:hAnsi="Cambria Math"/>
+            </w:rPr>
+            <m:t>)</m:t>
+          </m:r>
+          <m:r>
+            <w:rPr>
+              <w:rFonts w:ascii="Cambria Math" w:hAnsi="Cambria Math"/>
+            </w:rPr>
+            <m:t xml:space="preserve">, картинка </m:t>
+          </m:r>
+          <m:m>
+            <m:mPr>
+              <m:mcs>
+                <m:mc>
+                  <m:mcPr>
+                    <m:count m:val="1"/>
+                    <m:mcJc m:val="center"/>
+                  </m:mcPr>
+                </m:mc>
+              </m:mcs>
+              <m:ctrlPr>
+                <w:rPr>
+                  <w:rFonts w:ascii="Cambria Math" w:hAnsi="Cambria Math"/>
+                  <w:i/>
+                </w:rPr>
+              </m:ctrlPr>
+            </m:mPr>
+            <m:mr>
+              <m:e>
+                <m:r>
+                  <w:rPr>
+                    <w:rFonts w:ascii="Cambria Math" w:hAnsi="Cambria Math"/>
+                    <w:i/>
+                  </w:rPr>
+                  <w:drawing>
+                    <wp:inline distT="0" distB="0" distL="0" distR="0" wp14:anchorId="6471A8A7" wp14:editId="775FED86">
+                      <wp:extent cx="514422" cy="228632"/>
+                      <wp:effectExtent l="0" t="0" r="0" b="0"/>
+                      <wp:docPr id="1" name="Рисунок 1"/>
+                      <wp:cNvGraphicFramePr>
+                        <a:graphicFrameLocks xmlns:a="http://schemas.openxmlformats.org/drawingml/2006/main" noChangeAspect="1"/>
+                      </wp:cNvGraphicFramePr>
+                      <a:graphic xmlns:a="http://schemas.openxmlformats.org/drawingml/2006/main">
+                        <a:graphicData uri="http://schemas.openxmlformats.org/drawingml/2006/picture">
+                          <pic:pic xmlns:pic="http://schemas.openxmlformats.org/drawingml/2006/picture">
+                            <pic:nvPicPr>
+                              <pic:cNvPr id="1" name=""/>
+                              <pic:cNvPicPr/>
+                            </pic:nvPicPr>
+                            <pic:blipFill>
+                              <a:blip r:embed="rId6"/>
+                              <a:stretch>
+                                <a:fillRect/>
+                              </a:stretch>
+                            </pic:blipFill>
+                            <pic:spPr>
+                              <a:xfrm>
+                                <a:off x="0" y="0"/>
+                                <a:ext cx="514422" cy="228632"/>
+                              </a:xfrm>
+                              <a:prstGeom prst="rect">
+                                <a:avLst/>
+                              </a:prstGeom>
+                            </pic:spPr>
+                          </pic:pic>
+                        </a:graphicData>
+                      </a:graphic>
+                    </wp:inline>
+                  </w:drawing>
+                </m:r>
+              </m:e>
+            </m:mr>
+            <m:mr>
+              <m:e>
+                <m:r>
+                  <w:rPr>
+                    <w:rFonts w:ascii="Cambria Math" w:hAnsi="Cambria Math"/>
+                  </w:rPr>
+                  <m:t>5</m:t>
+                </m:r>
+              </m:e>
+            </m:mr>
+          </m:m>
+          <m:r>
+            <w:rPr>
+              <w:rFonts w:ascii="Cambria Math" w:hAnsi="Cambria Math"/>
+            </w:rPr>
+            <m:t xml:space="preserve"> </m:t>
+          </m:r>
+          <m:sSup>
+            <m:sSupPr>
+              <m:ctrlPr>
+                <w:rPr>
+                  <w:rFonts w:ascii="Cambria Math" w:hAnsi="Cambria Math"/>
+                </w:rPr>
+              </m:ctrlPr>
+            </m:sSupPr>
+            <m:e>
+              <m:d>
+                <m:dPr>
+                  <m:ctrlPr>
+                    <w:rPr>
+                      <w:rFonts w:ascii="Cambria Math" w:hAnsi="Cambria Math"/>
+                    </w:rPr>
+                  </m:ctrlPr>
+                </m:dPr>
+                <m:e>
+                  <m:r>
+                    <w:rPr>
+                      <w:rFonts w:ascii="Cambria Math" w:hAnsi="Cambria Math"/>
+                    </w:rPr>
+                    <m:t>x+a</m:t>
+                  </m:r>
+                </m:e>
+              </m:d>
+            </m:e>
+            <m:sup>
+              <m:r>
+                <w:rPr>
+                  <w:rFonts w:ascii="Cambria Math" w:hAnsi="Cambria Math"/>
+                </w:rPr>
+                <m:t>n</m:t>
+              </m:r>
+            </m:sup>
+          </m:sSup>
+          <m:r>
+            <w:rPr>
+              <w:rFonts w:ascii="Cambria Math" w:eastAsia="Cambria Math" w:hAnsi="Cambria Math" w:cs="Cambria Math"/>
+            </w:rPr>
+            <m:t>=</m:t>
+          </m:r>
+          <m:nary>
+            <m:naryPr>
+              <m:chr m:val="∑"/>
+              <m:grow m:val="1"/>
+              <m:ctrlPr>
+                <w:rPr>
+                  <w:rFonts w:ascii="Cambria Math" w:hAnsi="Cambria Math"/>
+                </w:rPr>
+              </m:ctrlPr>
+            </m:naryPr>
+            <m:sub>
+              <m:r>
+                <w:rPr>
+                  <w:rFonts w:ascii="Cambria Math" w:eastAsia="Cambria Math" w:hAnsi="Cambria Math" w:cs="Cambria Math"/>
+                </w:rPr>
+                <m:t>k=0</m:t>
+              </m:r>
+            </m:sub>
+            <m:sup>
+              <m:r>
+                <w:rPr>
+                  <w:rFonts w:ascii="Cambria Math" w:eastAsia="Cambria Math" w:hAnsi="Cambria Math" w:cs="Cambria Math"/>
+                </w:rPr>
+                <m:t>n</m:t>
+              </m:r>
+            </m:sup>
+            <m:e>
+              <m:d>
+                <m:dPr>
+                  <m:ctrlPr>
+                    <w:rPr>
+                      <w:rFonts w:ascii="Cambria Math" w:hAnsi="Cambria Math"/>
+                    </w:rPr>
+                  </m:ctrlPr>
+                </m:dPr>
+                <m:e>
+                  <m:f>
+                    <m:fPr>
+                      <m:type m:val="noBar"/>
+                      <m:ctrlPr>
+                        <w:rPr>
+                          <w:rFonts w:ascii="Cambria Math" w:hAnsi="Cambria Math"/>
+                        </w:rPr>
+                      </m:ctrlPr>
+                    </m:fPr>
+                    <m:num>
+                      <m:r>
+                        <w:rPr>
+                          <w:rFonts w:ascii="Cambria Math" w:eastAsia="Cambria Math" w:hAnsi="Cambria Math" w:cs="Cambria Math"/>
+                        </w:rPr>
+                        <m:t>n</m:t>
+                      </m:r>
+                    </m:num>
+                    <m:den>
+                      <m:r>
+                        <w:rPr>
+                          <w:rFonts w:ascii="Cambria Math" w:eastAsia="Cambria Math" w:hAnsi="Cambria Math" w:cs="Cambria Math"/>
+                        </w:rPr>
+                        <m:t>k</m:t>
+                      </m:r>
+                    </m:den>
+                  </m:f>
+                </m:e>
+              </m:d>
+              <m:sSup>
+                <m:sSupPr>
+                  <m:ctrlPr>
+                    <w:rPr>
+                      <w:rFonts w:ascii="Cambria Math" w:hAnsi="Cambria Math"/>
+                    </w:rPr>
+                  </m:ctrlPr>
+                </m:sSupPr>
+                <m:e>
+                  <m:r>
+                    <w:rPr>
+                      <w:rFonts w:ascii="Cambria Math" w:eastAsia="Cambria Math" w:hAnsi="Cambria Math" w:cs="Cambria Math"/>
+                    </w:rPr>
+                    <m:t>x</m:t>
+                  </m:r>
+                </m:e>
+                <m:sup>
+                  <m:r>
+                    <w:rPr>
+                      <w:rFonts w:ascii="Cambria Math" w:eastAsia="Cambria Math" w:hAnsi="Cambria Math" w:cs="Cambria Math"/>
+                    </w:rPr>
+                    <m:t>k</m:t>
+                  </m:r>
+                </m:sup>
+              </m:sSup>
+              <m:sSup>
+                <m:sSupPr>
+                  <m:ctrlPr>
+                    <w:rPr>
+                      <w:rFonts w:ascii="Cambria Math" w:hAnsi="Cambria Math"/>
+                    </w:rPr>
+                  </m:ctrlPr>
+                </m:sSupPr>
+                <m:e>
+                  <m:r>
+                    <w:rPr>
+                      <w:rFonts w:ascii="Cambria Math" w:eastAsia="Cambria Math" w:hAnsi="Cambria Math" w:cs="Cambria Math"/>
+                    </w:rPr>
+                    <m:t>a</m:t>
+                  </m:r>
+                </m:e>
+                <m:sup>
+                  <m:r>
+                    <w:rPr>
+                      <w:rFonts w:ascii="Cambria Math" w:eastAsia="Cambria Math" w:hAnsi="Cambria Math" w:cs="Cambria Math"/>
+                    </w:rPr>
+                    <m:t>n-k</m:t>
+                  </m:r>
+                </m:sup>
+              </m:sSup>
+            </m:e>
+          </m:nary>
+        </m:oMath>
+      </m:oMathPara>
+    </w:p>
+    <w:p>
+      <w:pPr>
         <w:spacing w:line="259" w:lineRule="auto"/>
       </w:pPr>
       <w:r>
@@ -1909,16 +2206,11 @@
         <w:sym w:font="Symbol" w:char="F0E5"/>
       </w:r>
       <w:r>
-        <w:rPr>
-          <w:lang w:val="en-US"/>
-        </w:rPr>
         <w:t xml:space="preserve"> (</w:t>
       </w:r>
       <w:r>
         <w:t>сигма – символ суммы)</w:t>
       </w:r>
-      <w:bookmarkStart w:id="1" w:name="_GoBack"/>
-      <w:bookmarkEnd w:id="1"/>
     </w:p>
     <w:p>
       <w:pPr>
@@ -1953,7 +2245,7 @@
       <w:pPr>
         <w:spacing w:line="259" w:lineRule="auto"/>
       </w:pPr>
-      <w:hyperlink r:id="rId6" w:history="1">
+      <w:hyperlink r:id="rId7" w:history="1">
         <w:r>
           <w:rPr>
             <w:rStyle w:val="af8"/>
@@ -1977,7 +2269,7 @@
       <w:pPr>
         <w:spacing w:line="259" w:lineRule="auto"/>
       </w:pPr>
-      <w:hyperlink r:id="rId7" w:history="1">
+      <w:hyperlink r:id="rId8" w:history="1">
         <w:proofErr w:type="spellStart"/>
         <w:r>
           <w:rPr>
@@ -2064,7 +2356,7 @@
       <w:pPr>
         <w:spacing w:line="259" w:lineRule="auto"/>
       </w:pPr>
-      <w:hyperlink r:id="rId8" w:history="1">
+      <w:hyperlink r:id="rId9" w:history="1">
         <w:r>
           <w:rPr>
             <w:rStyle w:val="af8"/>
@@ -2085,7 +2377,7 @@
       <w:pPr>
         <w:spacing w:line="259" w:lineRule="auto"/>
       </w:pPr>
-      <w:hyperlink r:id="rId9" w:tooltip="Поисковая страница Яндекс" w:history="1">
+      <w:hyperlink r:id="rId10" w:tooltip="Поисковая страница Яндекс" w:history="1">
         <w:r>
           <w:rPr>
             <w:rStyle w:val="af8"/>
@@ -2106,7 +2398,7 @@
       <w:pPr>
         <w:spacing w:line="259" w:lineRule="auto"/>
       </w:pPr>
-      <w:hyperlink r:id="rId10" w:history="1">
+      <w:hyperlink r:id="rId11" w:history="1">
         <w:r>
           <w:rPr>
             <w:rStyle w:val="af8"/>
@@ -9932,7 +10224,7 @@
         <v:path o:extrusionok="f" gradientshapeok="t" o:connecttype="rect"/>
         <o:lock v:ext="edit" aspectratio="t"/>
       </v:shapetype>
-      <v:shape id="_x0000_i1028" type="#_x0000_t75" style="width:331.5pt;height:225.75pt" o:bullet="t">
+      <v:shape id="_x0000_i1035" type="#_x0000_t75" style="width:331.5pt;height:225.75pt" o:bullet="t">
         <v:imagedata r:id="rId1" o:title="Снимок экрана 2023-08-08 135539"/>
       </v:shape>
     </w:pict>
@@ -13761,7 +14053,7 @@
 </file>
 
 <file path=customXml/itemProps1.xml><?xml version="1.0" encoding="utf-8"?>
-<ds:datastoreItem xmlns:ds="http://schemas.openxmlformats.org/officeDocument/2006/customXml" ds:itemID="{76535179-9F9F-4067-B063-F4C957887D84}">
+<ds:datastoreItem xmlns:ds="http://schemas.openxmlformats.org/officeDocument/2006/customXml" ds:itemID="{EEDE87B8-5DE3-4E4C-8031-2CE6FE256978}">
   <ds:schemaRefs>
     <ds:schemaRef ds:uri="http://schemas.openxmlformats.org/officeDocument/2006/bibliography"/>
   </ds:schemaRefs>

</xml_diff>

<commit_message>
Add hyphens for Omath
</commit_message>
<xml_diff>
--- a/tests/examples/content_check.docx
+++ b/tests/examples/content_check.docx
@@ -172,7 +172,6 @@
           <w:vertAlign w:val="superscript"/>
         </w:rPr>
       </w:pPr>
-      <w:proofErr w:type="spellStart"/>
       <w:r>
         <w:rPr>
           <w:b/>
@@ -199,7 +198,6 @@
         </w:rPr>
         <w:t>ексно</w:t>
       </w:r>
-      <w:proofErr w:type="spellEnd"/>
     </w:p>
     <w:p>
       <w:pPr>
@@ -351,101 +349,8 @@
         <w:t>:</w:t>
       </w:r>
       <w:r>
-        <w:t xml:space="preserve"> заполнитель </w:t>
-      </w:r>
-      <w:proofErr w:type="spellStart"/>
-      <w:r>
-        <w:t>заполнитель</w:t>
-      </w:r>
-      <w:proofErr w:type="spellEnd"/>
-      <w:r>
-        <w:t xml:space="preserve"> </w:t>
-      </w:r>
-      <w:proofErr w:type="spellStart"/>
-      <w:r>
-        <w:t>заполнитель</w:t>
-      </w:r>
-      <w:proofErr w:type="spellEnd"/>
-      <w:r>
-        <w:t xml:space="preserve"> </w:t>
-      </w:r>
-      <w:proofErr w:type="spellStart"/>
-      <w:r>
-        <w:t>заполнитель</w:t>
-      </w:r>
-      <w:proofErr w:type="spellEnd"/>
-      <w:r>
-        <w:t xml:space="preserve"> </w:t>
-      </w:r>
-      <w:proofErr w:type="spellStart"/>
-      <w:r>
-        <w:t>заполнитель</w:t>
-      </w:r>
-      <w:proofErr w:type="spellEnd"/>
-      <w:r>
-        <w:t xml:space="preserve"> </w:t>
-      </w:r>
-      <w:proofErr w:type="spellStart"/>
-      <w:r>
-        <w:t>заполнитель</w:t>
-      </w:r>
-      <w:proofErr w:type="spellEnd"/>
-      <w:r>
-        <w:t xml:space="preserve"> </w:t>
-      </w:r>
-      <w:proofErr w:type="spellStart"/>
-      <w:r>
-        <w:t>заполнитель</w:t>
-      </w:r>
-      <w:proofErr w:type="spellEnd"/>
-      <w:r>
-        <w:t xml:space="preserve"> </w:t>
-      </w:r>
-      <w:proofErr w:type="spellStart"/>
-      <w:r>
-        <w:t>заполнитель</w:t>
-      </w:r>
-      <w:proofErr w:type="spellEnd"/>
-      <w:r>
-        <w:t xml:space="preserve"> </w:t>
-      </w:r>
-      <w:proofErr w:type="spellStart"/>
-      <w:r>
-        <w:t>заполнитель</w:t>
-      </w:r>
-      <w:proofErr w:type="spellEnd"/>
-      <w:r>
-        <w:t xml:space="preserve"> </w:t>
-      </w:r>
-      <w:proofErr w:type="spellStart"/>
-      <w:r>
-        <w:t>заполнитель</w:t>
-      </w:r>
-      <w:proofErr w:type="spellEnd"/>
-      <w:r>
-        <w:t xml:space="preserve"> </w:t>
-      </w:r>
-      <w:proofErr w:type="spellStart"/>
-      <w:r>
-        <w:t>заполнитель</w:t>
-      </w:r>
-      <w:proofErr w:type="spellEnd"/>
-      <w:r>
-        <w:t xml:space="preserve"> </w:t>
-      </w:r>
-      <w:proofErr w:type="spellStart"/>
-      <w:r>
-        <w:t>заполнитель</w:t>
-      </w:r>
-      <w:proofErr w:type="spellEnd"/>
-      <w:r>
-        <w:t xml:space="preserve"> </w:t>
-      </w:r>
-      <w:proofErr w:type="spellStart"/>
-      <w:r>
-        <w:t>заполнитель</w:t>
-      </w:r>
-      <w:proofErr w:type="spellEnd"/>
+        <w:t xml:space="preserve"> заполнитель заполнитель заполнитель заполнитель заполнитель заполнитель заполнитель заполнитель заполнитель заполнитель заполнитель заполнитель заполнитель</w:t>
+      </w:r>
     </w:p>
     <w:p>
       <w:pPr>
@@ -768,6 +673,11 @@
       </m:oMathPara>
     </w:p>
     <w:p>
+      <w:pPr>
+        <w:rPr>
+          <w:lang w:val="en-US"/>
+        </w:rPr>
+      </w:pPr>
       <m:oMathPara>
         <m:oMath>
           <m:r>
@@ -803,8 +713,6 @@
           </m:sSup>
         </m:oMath>
       </m:oMathPara>
-      <w:bookmarkStart w:id="1" w:name="_GoBack"/>
-      <w:bookmarkEnd w:id="1"/>
     </w:p>
     <w:p>
       <m:oMathPara>
@@ -1920,26 +1828,55 @@
             <w:rPr>
               <w:rFonts w:ascii="Cambria Math" w:hAnsi="Cambria Math"/>
             </w:rPr>
-            <m:t>Сигма-символ (</m:t>
+            <m:t>Сигма-символ</m:t>
+            <w:softHyphen/>
           </m:r>
+          <m:d>
+            <m:dPr>
+              <m:ctrlPr>
+                <w:rPr>
+                  <w:rFonts w:ascii="Cambria Math" w:hAnsi="Cambria Math"/>
+                  <w:i/>
+                </w:rPr>
+              </m:ctrlPr>
+            </m:dPr>
+            <m:e>
+              <m:r>
+                <w:rPr>
+                  <w:rFonts w:ascii="Cambria Math" w:hAnsi="Cambria Math"/>
+                  <w:i/>
+                </w:rPr>
+                <w:sym w:font="Symbol" w:char="F0E5"/>
+              </m:r>
+            </m:e>
+          </m:d>
           <m:r>
             <w:rPr>
               <w:rFonts w:ascii="Cambria Math" w:hAnsi="Cambria Math"/>
-              <w:i/>
             </w:rPr>
-            <w:sym w:font="Symbol" w:char="F0E5"/>
+            <m:t>,к</m:t>
           </m:r>
           <m:r>
             <w:rPr>
               <w:rFonts w:ascii="Cambria Math" w:hAnsi="Cambria Math"/>
             </w:rPr>
-            <m:t>)</m:t>
+            <w:noBreakHyphen/>
           </m:r>
+          <w:bookmarkStart w:id="1" w:name="_GoBack"/>
+          <w:bookmarkEnd w:id="1"/>
           <m:r>
             <w:rPr>
               <w:rFonts w:ascii="Cambria Math" w:hAnsi="Cambria Math"/>
             </w:rPr>
-            <m:t xml:space="preserve">, картинка </m:t>
+            <w:br/>
+          </m:r>
+        </m:oMath>
+        <m:oMath>
+          <m:r>
+            <w:rPr>
+              <w:rFonts w:ascii="Cambria Math" w:hAnsi="Cambria Math"/>
+            </w:rPr>
+            <m:t xml:space="preserve">артинка </m:t>
           </m:r>
           <m:m>
             <m:mPr>
@@ -2270,7 +2207,6 @@
         <w:spacing w:line="259" w:lineRule="auto"/>
       </w:pPr>
       <w:hyperlink r:id="rId8" w:history="1">
-        <w:proofErr w:type="spellStart"/>
         <w:r>
           <w:rPr>
             <w:rStyle w:val="af8"/>
@@ -2278,7 +2214,6 @@
           </w:rPr>
           <w:t>abc</w:t>
         </w:r>
-        <w:proofErr w:type="spellEnd"/>
         <w:r>
           <w:rPr>
             <w:rStyle w:val="af8"/>
@@ -10224,7 +10159,7 @@
         <v:path o:extrusionok="f" gradientshapeok="t" o:connecttype="rect"/>
         <o:lock v:ext="edit" aspectratio="t"/>
       </v:shapetype>
-      <v:shape id="_x0000_i1035" type="#_x0000_t75" style="width:331.5pt;height:225.75pt" o:bullet="t">
+      <v:shape id="_x0000_i1037" type="#_x0000_t75" style="width:331.5pt;height:225.75pt" o:bullet="t">
         <v:imagedata r:id="rId1" o:title="Снимок экрана 2023-08-08 135539"/>
       </v:shape>
     </w:pict>
@@ -14053,7 +13988,7 @@
 </file>
 
 <file path=customXml/itemProps1.xml><?xml version="1.0" encoding="utf-8"?>
-<ds:datastoreItem xmlns:ds="http://schemas.openxmlformats.org/officeDocument/2006/customXml" ds:itemID="{EEDE87B8-5DE3-4E4C-8031-2CE6FE256978}">
+<ds:datastoreItem xmlns:ds="http://schemas.openxmlformats.org/officeDocument/2006/customXml" ds:itemID="{ECACE02B-4A00-4940-B518-5BF4BF27795C}">
   <ds:schemaRefs>
     <ds:schemaRef ds:uri="http://schemas.openxmlformats.org/officeDocument/2006/bibliography"/>
   </ds:schemaRefs>

</xml_diff>

<commit_message>
Add color but got bug with char graph...
</commit_message>
<xml_diff>
--- a/tests/examples/content_check.docx
+++ b/tests/examples/content_check.docx
@@ -157,6 +157,235 @@
           <w:smallCaps/>
         </w:rPr>
         <w:t>малые прописные</w:t>
+      </w:r>
+    </w:p>
+    <w:p>
+      <w:pPr>
+        <w:rPr>
+          <w:color w:val="00B050"/>
+        </w:rPr>
+      </w:pPr>
+      <w:r>
+        <w:rPr>
+          <w:color w:val="00B050"/>
+        </w:rPr>
+        <w:t>Ц</w:t>
+      </w:r>
+      <w:r>
+        <w:rPr>
+          <w:color w:val="FFC000"/>
+        </w:rPr>
+        <w:t>ве</w:t>
+      </w:r>
+      <w:r>
+        <w:rPr>
+          <w:color w:val="00B050"/>
+        </w:rPr>
+        <w:t xml:space="preserve">тной </w:t>
+      </w:r>
+      <w:r>
+        <w:rPr>
+          <w:color w:val="7030A0"/>
+        </w:rPr>
+        <w:t>текст</w:t>
+      </w:r>
+    </w:p>
+    <w:p>
+      <w:pPr>
+        <w:rPr>
+          <w:sz w:val="40"/>
+          <w:szCs w:val="40"/>
+        </w:rPr>
+      </w:pPr>
+      <w:r>
+        <w:rPr>
+          <w:sz w:val="40"/>
+          <w:szCs w:val="40"/>
+        </w:rPr>
+        <w:t>Другой размер</w:t>
+      </w:r>
+      <w:bookmarkStart w:id="0" w:name="_GoBack"/>
+      <w:bookmarkEnd w:id="0"/>
+    </w:p>
+    <w:p>
+      <w:r>
+        <w:rPr>
+          <w:rFonts w:ascii="Calibri" w:hAnsi="Calibri" w:cs="Calibri"/>
+        </w:rPr>
+        <w:t>Другой</w:t>
+      </w:r>
+      <w:r>
+        <w:rPr>
+          <w:rFonts w:ascii="Algerian" w:hAnsi="Algerian"/>
+        </w:rPr>
+        <w:t xml:space="preserve"> </w:t>
+      </w:r>
+      <w:r>
+        <w:rPr>
+          <w:rFonts w:ascii="Calibri" w:hAnsi="Calibri" w:cs="Calibri"/>
+        </w:rPr>
+        <w:t>шрифт</w:t>
+      </w:r>
+      <w:r>
+        <w:rPr>
+          <w:rFonts w:ascii="Algerian" w:hAnsi="Algerian"/>
+        </w:rPr>
+        <w:t xml:space="preserve"> (</w:t>
+      </w:r>
+      <w:r>
+        <w:rPr>
+          <w:rFonts w:ascii="Algerian" w:hAnsi="Algerian"/>
+          <w:lang w:val="en-US"/>
+        </w:rPr>
+        <w:t>ALEGRIAN</w:t>
+      </w:r>
+      <w:r>
+        <w:rPr>
+          <w:rFonts w:ascii="Algerian" w:hAnsi="Algerian"/>
+        </w:rPr>
+        <w:t>)</w:t>
+      </w:r>
+    </w:p>
+    <w:p>
+      <w:r>
+        <w:rPr>
+          <w:highlight w:val="cyan"/>
+        </w:rPr>
+        <w:t>Выделение текста</w:t>
+      </w:r>
+    </w:p>
+    <w:p>
+      <w:r>
+        <w:t xml:space="preserve">Текстовые эффекты: </w:t>
+      </w:r>
+      <w:r>
+        <w:rPr>
+          <w:sz w:val="36"/>
+          <w:szCs w:val="36"/>
+          <w14:textOutline w14:w="6350" w14:cap="rnd" w14:cmpd="sng" w14:algn="ctr">
+            <w14:solidFill>
+              <w14:srgbClr w14:val="0070C0"/>
+            </w14:solidFill>
+            <w14:prstDash w14:val="sysDash"/>
+            <w14:bevel/>
+          </w14:textOutline>
+        </w:rPr>
+        <w:t>контур</w:t>
+      </w:r>
+      <w:r>
+        <w:t xml:space="preserve">, </w:t>
+      </w:r>
+      <w:r>
+        <w:rPr>
+          <w:sz w:val="36"/>
+          <w:szCs w:val="36"/>
+          <w14:shadow w14:blurRad="60007" w14:dist="200025" w14:dir="15000000" w14:sx="100000" w14:sy="30000" w14:kx="-1800000" w14:ky="0" w14:algn="bl">
+            <w14:srgbClr w14:val="000000">
+              <w14:alpha w14:val="68000"/>
+            </w14:srgbClr>
+          </w14:shadow>
+        </w:rPr>
+        <w:t>тень</w:t>
+      </w:r>
+      <w:r>
+        <w:t xml:space="preserve">, </w:t>
+      </w:r>
+      <w:r>
+        <w:rPr>
+          <w14:reflection w14:blurRad="6350" w14:stA="55000" w14:stPos="0" w14:endA="50" w14:endPos="85000" w14:dist="0" w14:dir="5400000" w14:fadeDir="5400000" w14:sx="100000" w14:sy="-100000" w14:kx="0" w14:ky="0" w14:algn="bl"/>
+        </w:rPr>
+        <w:t>отражение</w:t>
+      </w:r>
+      <w:r>
+        <w:t xml:space="preserve">, </w:t>
+      </w:r>
+      <w:r>
+        <w:rPr>
+          <w14:glow w14:rad="101600">
+            <w14:schemeClr w14:val="accent4">
+              <w14:alpha w14:val="60000"/>
+              <w14:satMod w14:val="175000"/>
+            </w14:schemeClr>
+          </w14:glow>
+        </w:rPr>
+        <w:t>свечение</w:t>
+      </w:r>
+      <w:r>
+        <w:t xml:space="preserve">, </w:t>
+      </w:r>
+      <w:r>
+        <w:rPr>
+          <w14:numForm w14:val="oldStyle"/>
+          <w14:numSpacing w14:val="tabular"/>
+        </w:rPr>
+        <w:t>стили чисел</w:t>
+      </w:r>
+      <w:r>
+        <w:rPr>
+          <w14:numForm w14:val="oldStyle"/>
+          <w14:numSpacing w14:val="tabular"/>
+        </w:rPr>
+        <w:t>(123)</w:t>
+      </w:r>
+      <w:r>
+        <w:t xml:space="preserve">, </w:t>
+      </w:r>
+      <w:r>
+        <w:rPr>
+          <w14:ligatures w14:val="all"/>
+        </w:rPr>
+        <w:t>лигатуры</w:t>
+      </w:r>
+      <w:r>
+        <w:rPr>
+          <w14:ligatures w14:val="all"/>
+        </w:rPr>
+        <w:t xml:space="preserve"> (</w:t>
+      </w:r>
+      <w:r>
+        <w:rPr>
+          <w:lang w:val="en-US"/>
+          <w14:ligatures w14:val="all"/>
+        </w:rPr>
+        <w:t>FF</w:t>
+      </w:r>
+      <w:r>
+        <w:rPr>
+          <w14:ligatures w14:val="all"/>
+        </w:rPr>
+        <w:t xml:space="preserve"> </w:t>
+      </w:r>
+      <w:r>
+        <w:rPr>
+          <w:lang w:val="en-US"/>
+          <w14:ligatures w14:val="all"/>
+        </w:rPr>
+        <w:t>ff</w:t>
+      </w:r>
+      <w:r>
+        <w:rPr>
+          <w14:ligatures w14:val="all"/>
+        </w:rPr>
+        <w:t xml:space="preserve"> </w:t>
+      </w:r>
+      <w:r>
+        <w:rPr>
+          <w:lang w:val="en-US"/>
+          <w14:ligatures w14:val="all"/>
+        </w:rPr>
+        <w:t>fi</w:t>
+      </w:r>
+      <w:r>
+        <w:rPr>
+          <w14:ligatures w14:val="all"/>
+        </w:rPr>
+        <w:t>)</w:t>
+      </w:r>
+      <w:r>
+        <w:rPr>
+          <w14:ligatures w14:val="all"/>
+        </w:rPr>
+        <w:t>.</w:t>
       </w:r>
     </w:p>
     <w:p>
@@ -168,8 +397,26 @@
           <w:iCs/>
           <w:caps/>
           <w:strike/>
+          <w:sz w:val="36"/>
+          <w:szCs w:val="36"/>
           <w:u w:val="single"/>
           <w:vertAlign w:val="superscript"/>
+          <w:lang w:val="en-US"/>
+          <w14:glow w14:rad="63500">
+            <w14:schemeClr w14:val="accent3">
+              <w14:alpha w14:val="60000"/>
+              <w14:satMod w14:val="175000"/>
+            </w14:schemeClr>
+          </w14:glow>
+          <w14:shadow w14:blurRad="50800" w14:dist="38100" w14:dir="0" w14:sx="100000" w14:sy="100000" w14:kx="0" w14:ky="0" w14:algn="l">
+            <w14:srgbClr w14:val="000000">
+              <w14:alpha w14:val="60000"/>
+            </w14:srgbClr>
+          </w14:shadow>
+          <w14:reflection w14:blurRad="6350" w14:stA="55000" w14:stPos="0" w14:endA="50" w14:endPos="85000" w14:dist="29997" w14:dir="5400000" w14:fadeDir="5400000" w14:sx="100000" w14:sy="-100000" w14:kx="0" w14:ky="0" w14:algn="bl"/>
+          <w14:ligatures w14:val="all"/>
+          <w14:numForm w14:val="oldStyle"/>
+          <w14:numSpacing w14:val="tabular"/>
         </w:rPr>
       </w:pPr>
       <w:r>
@@ -180,10 +427,230 @@
           <w:iCs/>
           <w:smallCaps/>
           <w:strike/>
+          <w:sz w:val="36"/>
+          <w:szCs w:val="36"/>
+          <w:highlight w:val="yellow"/>
           <w:u w:val="single"/>
           <w:vertAlign w:val="subscript"/>
-        </w:rPr>
-        <w:t>Компл</w:t>
+          <w:lang w:val="en-US"/>
+          <w14:glow w14:rad="63500">
+            <w14:schemeClr w14:val="accent3">
+              <w14:alpha w14:val="60000"/>
+              <w14:satMod w14:val="175000"/>
+            </w14:schemeClr>
+          </w14:glow>
+          <w14:shadow w14:blurRad="50800" w14:dist="38100" w14:dir="0" w14:sx="100000" w14:sy="100000" w14:kx="0" w14:ky="0" w14:algn="l">
+            <w14:srgbClr w14:val="000000">
+              <w14:alpha w14:val="60000"/>
+            </w14:srgbClr>
+          </w14:shadow>
+          <w14:reflection w14:blurRad="6350" w14:stA="55000" w14:stPos="0" w14:endA="50" w14:endPos="85000" w14:dist="29997" w14:dir="5400000" w14:fadeDir="5400000" w14:sx="100000" w14:sy="-100000" w14:kx="0" w14:ky="0" w14:algn="bl"/>
+          <w14:ligatures w14:val="all"/>
+          <w14:numForm w14:val="oldStyle"/>
+          <w14:numSpacing w14:val="tabular"/>
+        </w:rPr>
+        <w:t>(</w:t>
+      </w:r>
+      <w:r>
+        <w:rPr>
+          <w:b/>
+          <w:bCs/>
+          <w:i/>
+          <w:iCs/>
+          <w:strike/>
+          <w:sz w:val="36"/>
+          <w:szCs w:val="36"/>
+          <w:highlight w:val="yellow"/>
+          <w:u w:val="single"/>
+          <w:vertAlign w:val="subscript"/>
+          <w:lang w:val="en-US"/>
+          <w14:glow w14:rad="63500">
+            <w14:schemeClr w14:val="accent3">
+              <w14:alpha w14:val="60000"/>
+              <w14:satMod w14:val="175000"/>
+            </w14:schemeClr>
+          </w14:glow>
+          <w14:shadow w14:blurRad="50800" w14:dist="38100" w14:dir="0" w14:sx="100000" w14:sy="100000" w14:kx="0" w14:ky="0" w14:algn="l">
+            <w14:srgbClr w14:val="000000">
+              <w14:alpha w14:val="60000"/>
+            </w14:srgbClr>
+          </w14:shadow>
+          <w14:reflection w14:blurRad="6350" w14:stA="55000" w14:stPos="0" w14:endA="50" w14:endPos="85000" w14:dist="29997" w14:dir="5400000" w14:fadeDir="5400000" w14:sx="100000" w14:sy="-100000" w14:kx="0" w14:ky="0" w14:algn="bl"/>
+          <w14:ligatures w14:val="all"/>
+          <w14:numForm w14:val="oldStyle"/>
+          <w14:numSpacing w14:val="tabular"/>
+        </w:rPr>
+        <w:t>ff</w:t>
+      </w:r>
+      <w:r>
+        <w:rPr>
+          <w:b/>
+          <w:bCs/>
+          <w:i/>
+          <w:iCs/>
+          <w:smallCaps/>
+          <w:strike/>
+          <w:sz w:val="36"/>
+          <w:szCs w:val="36"/>
+          <w:highlight w:val="yellow"/>
+          <w:u w:val="single"/>
+          <w:vertAlign w:val="subscript"/>
+          <w:lang w:val="en-US"/>
+          <w14:glow w14:rad="63500">
+            <w14:schemeClr w14:val="accent3">
+              <w14:alpha w14:val="60000"/>
+              <w14:satMod w14:val="175000"/>
+            </w14:schemeClr>
+          </w14:glow>
+          <w14:shadow w14:blurRad="50800" w14:dist="38100" w14:dir="0" w14:sx="100000" w14:sy="100000" w14:kx="0" w14:ky="0" w14:algn="l">
+            <w14:srgbClr w14:val="000000">
+              <w14:alpha w14:val="60000"/>
+            </w14:srgbClr>
+          </w14:shadow>
+          <w14:reflection w14:blurRad="6350" w14:stA="55000" w14:stPos="0" w14:endA="50" w14:endPos="85000" w14:dist="29997" w14:dir="5400000" w14:fadeDir="5400000" w14:sx="100000" w14:sy="-100000" w14:kx="0" w14:ky="0" w14:algn="bl"/>
+          <w14:ligatures w14:val="all"/>
+          <w14:numForm w14:val="oldStyle"/>
+          <w14:numSpacing w14:val="tabular"/>
+        </w:rPr>
+        <w:t>)</w:t>
+      </w:r>
+      <w:r>
+        <w:rPr>
+          <w:b/>
+          <w:bCs/>
+          <w:i/>
+          <w:iCs/>
+          <w:smallCaps/>
+          <w:strike/>
+          <w:sz w:val="36"/>
+          <w:szCs w:val="36"/>
+          <w:highlight w:val="yellow"/>
+          <w:u w:val="single"/>
+          <w:vertAlign w:val="subscript"/>
+          <w14:glow w14:rad="63500">
+            <w14:schemeClr w14:val="accent3">
+              <w14:alpha w14:val="60000"/>
+              <w14:satMod w14:val="175000"/>
+            </w14:schemeClr>
+          </w14:glow>
+          <w14:shadow w14:blurRad="50800" w14:dist="38100" w14:dir="0" w14:sx="100000" w14:sy="100000" w14:kx="0" w14:ky="0" w14:algn="l">
+            <w14:srgbClr w14:val="000000">
+              <w14:alpha w14:val="60000"/>
+            </w14:srgbClr>
+          </w14:shadow>
+          <w14:reflection w14:blurRad="6350" w14:stA="55000" w14:stPos="0" w14:endA="50" w14:endPos="85000" w14:dist="29997" w14:dir="5400000" w14:fadeDir="5400000" w14:sx="100000" w14:sy="-100000" w14:kx="0" w14:ky="0" w14:algn="bl"/>
+          <w14:ligatures w14:val="all"/>
+          <w14:numForm w14:val="oldStyle"/>
+          <w14:numSpacing w14:val="tabular"/>
+        </w:rPr>
+        <w:t>К</w:t>
+      </w:r>
+      <w:r>
+        <w:rPr>
+          <w:b/>
+          <w:bCs/>
+          <w:i/>
+          <w:iCs/>
+          <w:smallCaps/>
+          <w:strike/>
+          <w:sz w:val="24"/>
+          <w:szCs w:val="24"/>
+          <w:highlight w:val="yellow"/>
+          <w:u w:val="single"/>
+          <w:vertAlign w:val="subscript"/>
+          <w14:glow w14:rad="63500">
+            <w14:schemeClr w14:val="accent3">
+              <w14:alpha w14:val="60000"/>
+              <w14:satMod w14:val="175000"/>
+            </w14:schemeClr>
+          </w14:glow>
+          <w14:shadow w14:blurRad="50800" w14:dist="38100" w14:dir="0" w14:sx="100000" w14:sy="100000" w14:kx="0" w14:ky="0" w14:algn="l">
+            <w14:srgbClr w14:val="000000">
+              <w14:alpha w14:val="60000"/>
+            </w14:srgbClr>
+          </w14:shadow>
+          <w14:reflection w14:blurRad="6350" w14:stA="55000" w14:stPos="0" w14:endA="50" w14:endPos="85000" w14:dist="29997" w14:dir="5400000" w14:fadeDir="5400000" w14:sx="100000" w14:sy="-100000" w14:kx="0" w14:ky="0" w14:algn="bl"/>
+          <w14:textOutline w14:w="6350" w14:cap="rnd" w14:cmpd="sng" w14:algn="ctr">
+            <w14:solidFill>
+              <w14:srgbClr w14:val="FF0000"/>
+            </w14:solidFill>
+            <w14:prstDash w14:val="solid"/>
+            <w14:bevel/>
+          </w14:textOutline>
+          <w14:ligatures w14:val="all"/>
+          <w14:numForm w14:val="oldStyle"/>
+          <w14:numSpacing w14:val="tabular"/>
+        </w:rPr>
+        <w:t>ом</w:t>
+      </w:r>
+      <w:r>
+        <w:rPr>
+          <w:b/>
+          <w:bCs/>
+          <w:i/>
+          <w:iCs/>
+          <w:smallCaps/>
+          <w:strike/>
+          <w:sz w:val="36"/>
+          <w:szCs w:val="36"/>
+          <w:highlight w:val="yellow"/>
+          <w:u w:val="single"/>
+          <w:vertAlign w:val="subscript"/>
+          <w14:glow w14:rad="63500">
+            <w14:schemeClr w14:val="accent3">
+              <w14:alpha w14:val="60000"/>
+              <w14:satMod w14:val="175000"/>
+            </w14:schemeClr>
+          </w14:glow>
+          <w14:shadow w14:blurRad="50800" w14:dist="38100" w14:dir="0" w14:sx="100000" w14:sy="100000" w14:kx="0" w14:ky="0" w14:algn="l">
+            <w14:srgbClr w14:val="000000">
+              <w14:alpha w14:val="60000"/>
+            </w14:srgbClr>
+          </w14:shadow>
+          <w14:reflection w14:blurRad="6350" w14:stA="55000" w14:stPos="0" w14:endA="50" w14:endPos="85000" w14:dist="29997" w14:dir="5400000" w14:fadeDir="5400000" w14:sx="100000" w14:sy="-100000" w14:kx="0" w14:ky="0" w14:algn="bl"/>
+          <w14:textOutline w14:w="6350" w14:cap="rnd" w14:cmpd="sng" w14:algn="ctr">
+            <w14:solidFill>
+              <w14:srgbClr w14:val="FF0000"/>
+            </w14:solidFill>
+            <w14:prstDash w14:val="solid"/>
+            <w14:bevel/>
+          </w14:textOutline>
+          <w14:ligatures w14:val="all"/>
+          <w14:numForm w14:val="oldStyle"/>
+          <w14:numSpacing w14:val="tabular"/>
+        </w:rPr>
+        <w:t>п</w:t>
+      </w:r>
+      <w:r>
+        <w:rPr>
+          <w:b/>
+          <w:bCs/>
+          <w:i/>
+          <w:iCs/>
+          <w:smallCaps/>
+          <w:strike/>
+          <w:sz w:val="36"/>
+          <w:szCs w:val="36"/>
+          <w:highlight w:val="yellow"/>
+          <w:u w:val="single"/>
+          <w:vertAlign w:val="subscript"/>
+          <w14:glow w14:rad="63500">
+            <w14:schemeClr w14:val="accent3">
+              <w14:alpha w14:val="60000"/>
+              <w14:satMod w14:val="175000"/>
+            </w14:schemeClr>
+          </w14:glow>
+          <w14:shadow w14:blurRad="50800" w14:dist="38100" w14:dir="0" w14:sx="100000" w14:sy="100000" w14:kx="0" w14:ky="0" w14:algn="l">
+            <w14:srgbClr w14:val="000000">
+              <w14:alpha w14:val="60000"/>
+            </w14:srgbClr>
+          </w14:shadow>
+          <w14:reflection w14:blurRad="6350" w14:stA="55000" w14:stPos="0" w14:endA="50" w14:endPos="85000" w14:dist="29997" w14:dir="5400000" w14:fadeDir="5400000" w14:sx="100000" w14:sy="-100000" w14:kx="0" w14:ky="0" w14:algn="bl"/>
+          <w14:ligatures w14:val="all"/>
+          <w14:numForm w14:val="oldStyle"/>
+          <w14:numSpacing w14:val="tabular"/>
+        </w:rPr>
+        <w:t>л</w:t>
       </w:r>
       <w:r>
         <w:rPr>
@@ -193,10 +660,125 @@
           <w:iCs/>
           <w:caps/>
           <w:strike/>
+          <w:sz w:val="36"/>
+          <w:szCs w:val="36"/>
+          <w:highlight w:val="yellow"/>
           <w:u w:val="single"/>
           <w:vertAlign w:val="superscript"/>
-        </w:rPr>
-        <w:t>ексно</w:t>
+          <w14:glow w14:rad="63500">
+            <w14:schemeClr w14:val="accent3">
+              <w14:alpha w14:val="60000"/>
+              <w14:satMod w14:val="175000"/>
+            </w14:schemeClr>
+          </w14:glow>
+          <w14:shadow w14:blurRad="50800" w14:dist="38100" w14:dir="0" w14:sx="100000" w14:sy="100000" w14:kx="0" w14:ky="0" w14:algn="l">
+            <w14:srgbClr w14:val="000000">
+              <w14:alpha w14:val="60000"/>
+            </w14:srgbClr>
+          </w14:shadow>
+          <w14:reflection w14:blurRad="6350" w14:stA="55000" w14:stPos="0" w14:endA="50" w14:endPos="85000" w14:dist="29997" w14:dir="5400000" w14:fadeDir="5400000" w14:sx="100000" w14:sy="-100000" w14:kx="0" w14:ky="0" w14:algn="bl"/>
+          <w14:ligatures w14:val="all"/>
+          <w14:numForm w14:val="oldStyle"/>
+          <w14:numSpacing w14:val="tabular"/>
+        </w:rPr>
+        <w:t>ек</w:t>
+      </w:r>
+      <w:r>
+        <w:rPr>
+          <w:b/>
+          <w:bCs/>
+          <w:i/>
+          <w:iCs/>
+          <w:caps/>
+          <w:strike/>
+          <w:color w:val="7030A0"/>
+          <w:sz w:val="36"/>
+          <w:szCs w:val="36"/>
+          <w:highlight w:val="yellow"/>
+          <w:u w:val="single"/>
+          <w:vertAlign w:val="superscript"/>
+          <w14:glow w14:rad="63500">
+            <w14:schemeClr w14:val="accent3">
+              <w14:alpha w14:val="60000"/>
+              <w14:satMod w14:val="175000"/>
+            </w14:schemeClr>
+          </w14:glow>
+          <w14:shadow w14:blurRad="50800" w14:dist="38100" w14:dir="0" w14:sx="100000" w14:sy="100000" w14:kx="0" w14:ky="0" w14:algn="l">
+            <w14:srgbClr w14:val="000000">
+              <w14:alpha w14:val="60000"/>
+            </w14:srgbClr>
+          </w14:shadow>
+          <w14:reflection w14:blurRad="6350" w14:stA="55000" w14:stPos="0" w14:endA="50" w14:endPos="85000" w14:dist="29997" w14:dir="5400000" w14:fadeDir="5400000" w14:sx="100000" w14:sy="-100000" w14:kx="0" w14:ky="0" w14:algn="bl"/>
+          <w14:ligatures w14:val="all"/>
+          <w14:numForm w14:val="oldStyle"/>
+          <w14:numSpacing w14:val="tabular"/>
+        </w:rPr>
+        <w:t>с</w:t>
+      </w:r>
+      <w:r>
+        <w:rPr>
+          <w:b/>
+          <w:bCs/>
+          <w:i/>
+          <w:iCs/>
+          <w:caps/>
+          <w:strike/>
+          <w:color w:val="7030A0"/>
+          <w:sz w:val="36"/>
+          <w:szCs w:val="36"/>
+          <w:highlight w:val="yellow"/>
+          <w:u w:val="single"/>
+          <w:vertAlign w:val="superscript"/>
+          <w:lang w:val="en-US"/>
+          <w14:glow w14:rad="63500">
+            <w14:schemeClr w14:val="accent3">
+              <w14:alpha w14:val="60000"/>
+              <w14:satMod w14:val="175000"/>
+            </w14:schemeClr>
+          </w14:glow>
+          <w14:shadow w14:blurRad="50800" w14:dist="38100" w14:dir="0" w14:sx="100000" w14:sy="100000" w14:kx="0" w14:ky="0" w14:algn="l">
+            <w14:srgbClr w14:val="000000">
+              <w14:alpha w14:val="60000"/>
+            </w14:srgbClr>
+          </w14:shadow>
+          <w14:reflection w14:blurRad="6350" w14:stA="55000" w14:stPos="0" w14:endA="50" w14:endPos="85000" w14:dist="29997" w14:dir="5400000" w14:fadeDir="5400000" w14:sx="100000" w14:sy="-100000" w14:kx="0" w14:ky="0" w14:algn="bl"/>
+          <w14:ligatures w14:val="all"/>
+          <w14:numForm w14:val="oldStyle"/>
+          <w14:numSpacing w14:val="tabular"/>
+        </w:rPr>
+        <w:t>123</w:t>
+      </w:r>
+      <w:r>
+        <w:rPr>
+          <w:b/>
+          <w:bCs/>
+          <w:i/>
+          <w:iCs/>
+          <w:caps/>
+          <w:strike/>
+          <w:color w:val="7030A0"/>
+          <w:sz w:val="36"/>
+          <w:szCs w:val="36"/>
+          <w:highlight w:val="yellow"/>
+          <w:u w:val="single"/>
+          <w:vertAlign w:val="superscript"/>
+          <w14:glow w14:rad="63500">
+            <w14:schemeClr w14:val="accent3">
+              <w14:alpha w14:val="60000"/>
+              <w14:satMod w14:val="175000"/>
+            </w14:schemeClr>
+          </w14:glow>
+          <w14:shadow w14:blurRad="50800" w14:dist="38100" w14:dir="0" w14:sx="100000" w14:sy="100000" w14:kx="0" w14:ky="0" w14:algn="l">
+            <w14:srgbClr w14:val="000000">
+              <w14:alpha w14:val="60000"/>
+            </w14:srgbClr>
+          </w14:shadow>
+          <w14:reflection w14:blurRad="6350" w14:stA="55000" w14:stPos="0" w14:endA="50" w14:endPos="85000" w14:dist="29997" w14:dir="5400000" w14:fadeDir="5400000" w14:sx="100000" w14:sy="-100000" w14:kx="0" w14:ky="0" w14:algn="bl"/>
+          <w14:ligatures w14:val="all"/>
+          <w14:numForm w14:val="oldStyle"/>
+          <w14:numSpacing w14:val="tabular"/>
+        </w:rPr>
+        <w:t>но</w:t>
       </w:r>
     </w:p>
     <w:p>
@@ -377,7 +959,7 @@
         <w:t>Обычная</w:t>
       </w:r>
     </w:p>
-    <w:bookmarkStart w:id="0" w:name="Бином_Ньютона"/>
+    <w:bookmarkStart w:id="1" w:name="Бином_Ньютона"/>
     <w:p>
       <m:oMathPara>
         <m:oMath>
@@ -541,7 +1123,7 @@
           </m:nary>
         </m:oMath>
       </m:oMathPara>
-      <w:bookmarkEnd w:id="0"/>
+      <w:bookmarkEnd w:id="1"/>
     </w:p>
     <w:p>
       <m:oMathPara>
@@ -1829,6 +2411,14 @@
               <w:rFonts w:ascii="Cambria Math" w:hAnsi="Cambria Math"/>
             </w:rPr>
             <m:t>Сигма-символ</m:t>
+          </m:r>
+          <m:r>
+            <m:rPr>
+              <m:sty m:val="p"/>
+            </m:rPr>
+            <w:rPr>
+              <w:rFonts w:ascii="Cambria Math" w:hAnsi="Cambria Math"/>
+            </w:rPr>
             <w:softHyphen/>
           </m:r>
           <m:d>
@@ -1857,14 +2447,18 @@
             <m:t>,к</m:t>
           </m:r>
           <m:r>
+            <m:rPr>
+              <m:sty m:val="p"/>
+            </m:rPr>
             <w:rPr>
               <w:rFonts w:ascii="Cambria Math" w:hAnsi="Cambria Math"/>
             </w:rPr>
             <w:noBreakHyphen/>
           </m:r>
-          <w:bookmarkStart w:id="1" w:name="_GoBack"/>
-          <w:bookmarkEnd w:id="1"/>
           <m:r>
+            <m:rPr>
+              <m:sty m:val="p"/>
+            </m:rPr>
             <w:rPr>
               <w:rFonts w:ascii="Cambria Math" w:hAnsi="Cambria Math"/>
             </w:rPr>
@@ -1901,6 +2495,7 @@
                   <w:rPr>
                     <w:rFonts w:ascii="Cambria Math" w:hAnsi="Cambria Math"/>
                     <w:i/>
+                    <w:noProof/>
                   </w:rPr>
                   <w:drawing>
                     <wp:inline distT="0" distB="0" distL="0" distR="0" wp14:anchorId="6471A8A7" wp14:editId="775FED86">
@@ -10159,7 +10754,7 @@
         <v:path o:extrusionok="f" gradientshapeok="t" o:connecttype="rect"/>
         <o:lock v:ext="edit" aspectratio="t"/>
       </v:shapetype>
-      <v:shape id="_x0000_i1037" type="#_x0000_t75" style="width:331.5pt;height:225.75pt" o:bullet="t">
+      <v:shape id="_x0000_i1195" type="#_x0000_t75" style="width:331.5pt;height:225.75pt" o:bullet="t">
         <v:imagedata r:id="rId1" o:title="Снимок экрана 2023-08-08 135539"/>
       </v:shape>
     </w:pict>
@@ -13988,7 +14583,7 @@
 </file>
 
 <file path=customXml/itemProps1.xml><?xml version="1.0" encoding="utf-8"?>
-<ds:datastoreItem xmlns:ds="http://schemas.openxmlformats.org/officeDocument/2006/customXml" ds:itemID="{ECACE02B-4A00-4940-B518-5BF4BF27795C}">
+<ds:datastoreItem xmlns:ds="http://schemas.openxmlformats.org/officeDocument/2006/customXml" ds:itemID="{BD51CE4F-B971-43E2-9ECE-1D598533EA9A}">
   <ds:schemaRefs>
     <ds:schemaRef ds:uri="http://schemas.openxmlformats.org/officeDocument/2006/bibliography"/>
   </ds:schemaRefs>

</xml_diff>

<commit_message>
More right getting props for list and run
</commit_message>
<xml_diff>
--- a/tests/examples/content_check.docx
+++ b/tests/examples/content_check.docx
@@ -204,8 +204,6 @@
         </w:rPr>
         <w:t>Другой размер</w:t>
       </w:r>
-      <w:bookmarkStart w:id="0" w:name="_GoBack"/>
-      <w:bookmarkEnd w:id="0"/>
     </w:p>
     <w:p>
       <w:r>
@@ -355,6 +353,7 @@
         </w:rPr>
         <w:t xml:space="preserve"> </w:t>
       </w:r>
+      <w:proofErr w:type="spellStart"/>
       <w:r>
         <w:rPr>
           <w:lang w:val="en-US"/>
@@ -362,6 +361,7 @@
         </w:rPr>
         <w:t>ff</w:t>
       </w:r>
+      <w:proofErr w:type="spellEnd"/>
       <w:r>
         <w:rPr>
           <w14:ligatures w14:val="all"/>
@@ -401,7 +401,6 @@
           <w:szCs w:val="36"/>
           <w:u w:val="single"/>
           <w:vertAlign w:val="superscript"/>
-          <w:lang w:val="en-US"/>
           <w14:glow w14:rad="63500">
             <w14:schemeClr w14:val="accent3">
               <w14:alpha w14:val="60000"/>
@@ -432,7 +431,6 @@
           <w:highlight w:val="yellow"/>
           <w:u w:val="single"/>
           <w:vertAlign w:val="subscript"/>
-          <w:lang w:val="en-US"/>
           <w14:glow w14:rad="63500">
             <w14:schemeClr w14:val="accent3">
               <w14:alpha w14:val="60000"/>
@@ -495,7 +493,6 @@
           <w:highlight w:val="yellow"/>
           <w:u w:val="single"/>
           <w:vertAlign w:val="subscript"/>
-          <w:lang w:val="en-US"/>
           <w14:glow w14:rad="63500">
             <w14:schemeClr w14:val="accent3">
               <w14:alpha w14:val="60000"/>
@@ -729,7 +726,6 @@
           <w:highlight w:val="yellow"/>
           <w:u w:val="single"/>
           <w:vertAlign w:val="superscript"/>
-          <w:lang w:val="en-US"/>
           <w14:glow w14:rad="63500">
             <w14:schemeClr w14:val="accent3">
               <w14:alpha w14:val="60000"/>
@@ -887,7 +883,6 @@
         <w:pStyle w:val="1"/>
       </w:pPr>
       <w:r>
-        <w:lastRenderedPageBreak/>
         <w:t>Абзац</w:t>
       </w:r>
     </w:p>
@@ -931,8 +926,101 @@
         <w:t>:</w:t>
       </w:r>
       <w:r>
-        <w:t xml:space="preserve"> заполнитель заполнитель заполнитель заполнитель заполнитель заполнитель заполнитель заполнитель заполнитель заполнитель заполнитель заполнитель заполнитель</w:t>
-      </w:r>
+        <w:t xml:space="preserve"> заполнитель </w:t>
+      </w:r>
+      <w:proofErr w:type="spellStart"/>
+      <w:r>
+        <w:t>заполнитель</w:t>
+      </w:r>
+      <w:proofErr w:type="spellEnd"/>
+      <w:r>
+        <w:t xml:space="preserve"> </w:t>
+      </w:r>
+      <w:proofErr w:type="spellStart"/>
+      <w:r>
+        <w:t>заполнитель</w:t>
+      </w:r>
+      <w:proofErr w:type="spellEnd"/>
+      <w:r>
+        <w:t xml:space="preserve"> </w:t>
+      </w:r>
+      <w:proofErr w:type="spellStart"/>
+      <w:r>
+        <w:t>заполнитель</w:t>
+      </w:r>
+      <w:proofErr w:type="spellEnd"/>
+      <w:r>
+        <w:t xml:space="preserve"> </w:t>
+      </w:r>
+      <w:proofErr w:type="spellStart"/>
+      <w:r>
+        <w:t>заполнитель</w:t>
+      </w:r>
+      <w:proofErr w:type="spellEnd"/>
+      <w:r>
+        <w:t xml:space="preserve"> </w:t>
+      </w:r>
+      <w:proofErr w:type="spellStart"/>
+      <w:r>
+        <w:t>заполнитель</w:t>
+      </w:r>
+      <w:proofErr w:type="spellEnd"/>
+      <w:r>
+        <w:t xml:space="preserve"> </w:t>
+      </w:r>
+      <w:proofErr w:type="spellStart"/>
+      <w:r>
+        <w:t>заполнитель</w:t>
+      </w:r>
+      <w:proofErr w:type="spellEnd"/>
+      <w:r>
+        <w:t xml:space="preserve"> </w:t>
+      </w:r>
+      <w:proofErr w:type="spellStart"/>
+      <w:r>
+        <w:t>заполнитель</w:t>
+      </w:r>
+      <w:proofErr w:type="spellEnd"/>
+      <w:r>
+        <w:t xml:space="preserve"> </w:t>
+      </w:r>
+      <w:proofErr w:type="spellStart"/>
+      <w:r>
+        <w:t>заполнитель</w:t>
+      </w:r>
+      <w:proofErr w:type="spellEnd"/>
+      <w:r>
+        <w:t xml:space="preserve"> </w:t>
+      </w:r>
+      <w:proofErr w:type="spellStart"/>
+      <w:r>
+        <w:t>заполнитель</w:t>
+      </w:r>
+      <w:proofErr w:type="spellEnd"/>
+      <w:r>
+        <w:t xml:space="preserve"> </w:t>
+      </w:r>
+      <w:proofErr w:type="spellStart"/>
+      <w:r>
+        <w:t>заполнитель</w:t>
+      </w:r>
+      <w:proofErr w:type="spellEnd"/>
+      <w:r>
+        <w:t xml:space="preserve"> </w:t>
+      </w:r>
+      <w:proofErr w:type="spellStart"/>
+      <w:r>
+        <w:t>заполнитель</w:t>
+      </w:r>
+      <w:proofErr w:type="spellEnd"/>
+      <w:r>
+        <w:t xml:space="preserve"> </w:t>
+      </w:r>
+      <w:proofErr w:type="spellStart"/>
+      <w:r>
+        <w:t>заполнитель</w:t>
+      </w:r>
+      <w:proofErr w:type="spellEnd"/>
     </w:p>
     <w:p>
       <w:pPr>
@@ -947,7 +1035,6 @@
         <w:pStyle w:val="1"/>
       </w:pPr>
       <w:r>
-        <w:lastRenderedPageBreak/>
         <w:t>Формула</w:t>
       </w:r>
     </w:p>
@@ -959,7 +1046,7 @@
         <w:t>Обычная</w:t>
       </w:r>
     </w:p>
-    <w:bookmarkStart w:id="1" w:name="Бином_Ньютона"/>
+    <w:bookmarkStart w:id="0" w:name="Бином_Ньютона"/>
     <w:p>
       <m:oMathPara>
         <m:oMath>
@@ -1123,7 +1210,7 @@
           </m:nary>
         </m:oMath>
       </m:oMathPara>
-      <w:bookmarkEnd w:id="1"/>
+      <w:bookmarkEnd w:id="0"/>
     </w:p>
     <w:p>
       <m:oMathPara>
@@ -2726,7 +2813,6 @@
         <w:pStyle w:val="1"/>
       </w:pPr>
       <w:r>
-        <w:lastRenderedPageBreak/>
         <w:t>Символ</w:t>
       </w:r>
     </w:p>
@@ -2802,6 +2888,7 @@
         <w:spacing w:line="259" w:lineRule="auto"/>
       </w:pPr>
       <w:hyperlink r:id="rId8" w:history="1">
+        <w:proofErr w:type="spellStart"/>
         <w:r>
           <w:rPr>
             <w:rStyle w:val="af8"/>
@@ -2809,6 +2896,7 @@
           </w:rPr>
           <w:t>abc</w:t>
         </w:r>
+        <w:proofErr w:type="spellEnd"/>
         <w:r>
           <w:rPr>
             <w:rStyle w:val="af8"/>
@@ -2956,7 +3044,6 @@
         <w:pStyle w:val="1"/>
       </w:pPr>
       <w:r>
-        <w:lastRenderedPageBreak/>
         <w:t>Список</w:t>
       </w:r>
     </w:p>
@@ -3779,7 +3866,6 @@
         </w:numPr>
       </w:pPr>
       <w:r>
-        <w:lastRenderedPageBreak/>
         <w:t>2</w:t>
       </w:r>
     </w:p>
@@ -4355,7 +4441,6 @@
         </w:numPr>
       </w:pPr>
       <w:r>
-        <w:lastRenderedPageBreak/>
         <w:t>3.1</w:t>
       </w:r>
     </w:p>
@@ -4781,7 +4866,6 @@
         <w:pStyle w:val="1"/>
       </w:pPr>
       <w:r>
-        <w:lastRenderedPageBreak/>
         <w:t>Таблица</w:t>
       </w:r>
     </w:p>
@@ -5848,7 +5932,6 @@
         <w:pStyle w:val="2"/>
       </w:pPr>
       <w:r>
-        <w:lastRenderedPageBreak/>
         <w:t>Объединение клеток</w:t>
       </w:r>
     </w:p>
@@ -7609,7 +7692,6 @@
               </w:numPr>
             </w:pPr>
             <w:r>
-              <w:lastRenderedPageBreak/>
               <w:t>Маркер</w:t>
             </w:r>
             <w:r>
@@ -7633,7 +7715,6 @@
               </w:numPr>
             </w:pPr>
             <w:r>
-              <w:lastRenderedPageBreak/>
               <w:t>Десятичный</w:t>
             </w:r>
             <w:r>
@@ -7676,7 +7757,6 @@
               </w:numPr>
             </w:pPr>
             <w:r>
-              <w:lastRenderedPageBreak/>
               <w:t>Десятичный</w:t>
             </w:r>
             <w:r>
@@ -7706,7 +7786,6 @@
               </w:numPr>
             </w:pPr>
             <w:r>
-              <w:lastRenderedPageBreak/>
               <w:t>Порядковый</w:t>
             </w:r>
             <w:r>
@@ -7737,7 +7816,6 @@
               </w:numPr>
             </w:pPr>
             <w:r>
-              <w:lastRenderedPageBreak/>
               <w:t xml:space="preserve">Порядковый </w:t>
             </w:r>
             <w:r>
@@ -8702,11 +8780,7 @@
                           </w:numPr>
                         </w:pPr>
                         <w:r>
-                          <w:t>Многоуровн</w:t>
-                        </w:r>
-                        <w:r>
-                          <w:lastRenderedPageBreak/>
-                          <w:t>евый 2.1</w:t>
+                          <w:t>Многоуровневый 2.1</w:t>
                         </w:r>
                       </w:p>
                       <w:p>
@@ -8753,7 +8827,6 @@
                     <w:rPr>
                       <w:lang w:val="en-US"/>
                     </w:rPr>
-                    <w:lastRenderedPageBreak/>
                     <w:t>Filler</w:t>
                   </w:r>
                 </w:p>
@@ -8771,7 +8844,6 @@
                     <w:rPr>
                       <w:lang w:val="en-US"/>
                     </w:rPr>
-                    <w:lastRenderedPageBreak/>
                     <w:t>Filler</w:t>
                   </w:r>
                 </w:p>
@@ -8863,7 +8935,6 @@
               <w:rPr>
                 <w:lang w:val="en-US"/>
               </w:rPr>
-              <w:lastRenderedPageBreak/>
               <w:t>Filler</w:t>
             </w:r>
           </w:p>
@@ -9127,7 +9198,6 @@
               <w:rPr>
                 <w:lang w:val="en-US"/>
               </w:rPr>
-              <w:lastRenderedPageBreak/>
               <w:t>Filler</w:t>
             </w:r>
           </w:p>
@@ -9378,7 +9448,6 @@
         <w:pStyle w:val="1"/>
       </w:pPr>
       <w:r>
-        <w:lastRenderedPageBreak/>
         <w:t>Стиль</w:t>
       </w:r>
     </w:p>
@@ -9792,7 +9861,12 @@
         </w:numPr>
       </w:pPr>
       <w:r>
-        <w:t>Номер Курсив и Жирный и Подчеркивание</w:t>
+        <w:t>Номер Курсив и Жирный и Подчеркиван</w:t>
+      </w:r>
+      <w:bookmarkStart w:id="1" w:name="_GoBack"/>
+      <w:bookmarkEnd w:id="1"/>
+      <w:r>
+        <w:t>ие</w:t>
       </w:r>
     </w:p>
     <w:p>
@@ -10533,7 +10607,6 @@
           </w:tcPr>
           <w:p>
             <w:r>
-              <w:lastRenderedPageBreak/>
               <w:t>49</w:t>
             </w:r>
           </w:p>
@@ -10754,7 +10827,7 @@
         <v:path o:extrusionok="f" gradientshapeok="t" o:connecttype="rect"/>
         <o:lock v:ext="edit" aspectratio="t"/>
       </v:shapetype>
-      <v:shape id="_x0000_i1195" type="#_x0000_t75" style="width:331.5pt;height:225.75pt" o:bullet="t">
+      <v:shape id="_x0000_i1029" type="#_x0000_t75" style="width:331.5pt;height:225.75pt" o:bullet="t">
         <v:imagedata r:id="rId1" o:title="Снимок экрана 2023-08-08 135539"/>
       </v:shape>
     </w:pict>
@@ -13312,6 +13385,28 @@
   </w:num>
   <w:num w:numId="26">
     <w:abstractNumId w:val="21"/>
+    <w:lvlOverride w:ilvl="0">
+      <w:lvl w:ilvl="0">
+        <w:start w:val="1"/>
+        <w:numFmt w:val="decimal"/>
+        <w:lvlText w:val="%1)"/>
+        <w:lvlJc w:val="left"/>
+        <w:pPr>
+          <w:ind w:left="360" w:hanging="360"/>
+        </w:pPr>
+        <w:rPr>
+          <w:rFonts w:ascii="Bahnschrift" w:hAnsi="Bahnschrift"/>
+          <w:b/>
+          <w:i/>
+          <w:caps/>
+          <w:strike/>
+          <w:color w:val="FF0000"/>
+          <w:sz w:val="52"/>
+          <w:u w:val="dash" w:color="00B0F0"/>
+          <w:vertAlign w:val="subscript"/>
+        </w:rPr>
+      </w:lvl>
+    </w:lvlOverride>
   </w:num>
 </w:numbering>
 </file>
@@ -14583,7 +14678,7 @@
 </file>
 
 <file path=customXml/itemProps1.xml><?xml version="1.0" encoding="utf-8"?>
-<ds:datastoreItem xmlns:ds="http://schemas.openxmlformats.org/officeDocument/2006/customXml" ds:itemID="{BD51CE4F-B971-43E2-9ECE-1D598533EA9A}">
+<ds:datastoreItem xmlns:ds="http://schemas.openxmlformats.org/officeDocument/2006/customXml" ds:itemID="{05FBE2A4-4A61-4FC0-B097-ED989015E2EA}">
   <ds:schemaRefs>
     <ds:schemaRef ds:uri="http://schemas.openxmlformats.org/officeDocument/2006/bibliography"/>
   </ds:schemaRefs>

</xml_diff>

<commit_message>
Add TODO and update test_file for research
</commit_message>
<xml_diff>
--- a/tests/examples/content_check.docx
+++ b/tests/examples/content_check.docx
@@ -181,56 +181,63 @@
       <w:r>
         <w:t xml:space="preserve"> - Далее</w:t>
       </w:r>
+    </w:p>
+    <w:p>
+      <w:pPr>
+        <w:rPr>
+          <w:color w:val="00B050"/>
+        </w:rPr>
+      </w:pPr>
+      <w:r>
+        <w:rPr>
+          <w:color w:val="00B050"/>
+        </w:rPr>
+        <w:t>Ц</w:t>
+      </w:r>
+      <w:r>
+        <w:rPr>
+          <w:color w:val="FFC000"/>
+        </w:rPr>
+        <w:t>ве</w:t>
+      </w:r>
+      <w:r>
+        <w:rPr>
+          <w:color w:val="00B050"/>
+        </w:rPr>
+        <w:t xml:space="preserve">тной </w:t>
+      </w:r>
+      <w:r>
+        <w:rPr>
+          <w:color w:val="7030A0"/>
+        </w:rPr>
+        <w:t>текст</w:t>
+      </w:r>
+    </w:p>
+    <w:p>
+      <w:pPr>
+        <w:rPr>
+          <w:sz w:val="40"/>
+          <w:szCs w:val="40"/>
+        </w:rPr>
+      </w:pPr>
+      <w:r>
+        <w:rPr>
+          <w:sz w:val="40"/>
+          <w:szCs w:val="40"/>
+        </w:rPr>
+        <w:t>Другой размер</w:t>
+      </w:r>
+      <w:r>
+        <w:rPr>
+          <w:sz w:val="40"/>
+          <w:szCs w:val="40"/>
+        </w:rPr>
+        <w:t xml:space="preserve"> (20пт)</w:t>
+      </w:r>
       <w:bookmarkStart w:id="0" w:name="_GoBack"/>
       <w:bookmarkEnd w:id="0"/>
     </w:p>
     <w:p>
-      <w:pPr>
-        <w:rPr>
-          <w:color w:val="00B050"/>
-        </w:rPr>
-      </w:pPr>
-      <w:r>
-        <w:rPr>
-          <w:color w:val="00B050"/>
-        </w:rPr>
-        <w:t>Ц</w:t>
-      </w:r>
-      <w:r>
-        <w:rPr>
-          <w:color w:val="FFC000"/>
-        </w:rPr>
-        <w:t>ве</w:t>
-      </w:r>
-      <w:r>
-        <w:rPr>
-          <w:color w:val="00B050"/>
-        </w:rPr>
-        <w:t xml:space="preserve">тной </w:t>
-      </w:r>
-      <w:r>
-        <w:rPr>
-          <w:color w:val="7030A0"/>
-        </w:rPr>
-        <w:t>текст</w:t>
-      </w:r>
-    </w:p>
-    <w:p>
-      <w:pPr>
-        <w:rPr>
-          <w:sz w:val="40"/>
-          <w:szCs w:val="40"/>
-        </w:rPr>
-      </w:pPr>
-      <w:r>
-        <w:rPr>
-          <w:sz w:val="40"/>
-          <w:szCs w:val="40"/>
-        </w:rPr>
-        <w:t>Другой размер</w:t>
-      </w:r>
-    </w:p>
-    <w:p>
       <w:r>
         <w:rPr>
           <w:rFonts w:ascii="Calibri" w:hAnsi="Calibri" w:cs="Calibri"/>
@@ -275,6 +282,143 @@
           <w:highlight w:val="cyan"/>
         </w:rPr>
         <w:t>Выделение текста</w:t>
+      </w:r>
+      <w:r>
+        <w:rPr>
+          <w:highlight w:val="cyan"/>
+          <w:lang w:val="en-US"/>
+        </w:rPr>
+        <w:t xml:space="preserve"> (</w:t>
+      </w:r>
+      <w:r>
+        <w:rPr>
+          <w:highlight w:val="cyan"/>
+        </w:rPr>
+        <w:t>голубой)</w:t>
+      </w:r>
+    </w:p>
+    <w:p>
+      <w:pPr>
+        <w:rPr>
+          <w:w w:val="200"/>
+          <w:lang w:val="en-US"/>
+        </w:rPr>
+      </w:pPr>
+      <w:r>
+        <w:rPr>
+          <w:w w:val="200"/>
+        </w:rPr>
+        <w:t>Масштаб</w:t>
+      </w:r>
+      <w:r>
+        <w:rPr>
+          <w:w w:val="200"/>
+        </w:rPr>
+        <w:t xml:space="preserve"> 2</w:t>
+      </w:r>
+      <w:r>
+        <w:rPr>
+          <w:w w:val="200"/>
+          <w:lang w:val="en-US"/>
+        </w:rPr>
+        <w:t>00 %</w:t>
+      </w:r>
+    </w:p>
+    <w:p>
+      <w:r>
+        <w:t xml:space="preserve">Интервалы: </w:t>
+      </w:r>
+      <w:r>
+        <w:rPr>
+          <w:spacing w:val="100"/>
+        </w:rPr>
+        <w:t>разреженный</w:t>
+      </w:r>
+      <w:r>
+        <w:rPr>
+          <w:spacing w:val="100"/>
+        </w:rPr>
+        <w:t xml:space="preserve"> 5пт</w:t>
+      </w:r>
+      <w:r>
+        <w:t xml:space="preserve">, </w:t>
+      </w:r>
+      <w:r>
+        <w:rPr>
+          <w:spacing w:val="-40"/>
+        </w:rPr>
+        <w:t>уплотненный</w:t>
+      </w:r>
+      <w:r>
+        <w:rPr>
+          <w:spacing w:val="-40"/>
+        </w:rPr>
+        <w:t xml:space="preserve"> 2пт</w:t>
+      </w:r>
+    </w:p>
+    <w:p>
+      <w:r>
+        <w:t xml:space="preserve">Смещение: </w:t>
+      </w:r>
+      <w:r>
+        <w:rPr>
+          <w:position w:val="12"/>
+        </w:rPr>
+        <w:t>вверх</w:t>
+      </w:r>
+      <w:r>
+        <w:rPr>
+          <w:position w:val="12"/>
+        </w:rPr>
+        <w:t xml:space="preserve"> 6пт</w:t>
+      </w:r>
+      <w:r>
+        <w:t xml:space="preserve">, </w:t>
+      </w:r>
+      <w:r>
+        <w:rPr>
+          <w:position w:val="-20"/>
+        </w:rPr>
+        <w:t>вниз</w:t>
+      </w:r>
+      <w:r>
+        <w:rPr>
+          <w:position w:val="-20"/>
+        </w:rPr>
+        <w:t xml:space="preserve"> 10пт</w:t>
+      </w:r>
+    </w:p>
+    <w:p>
+      <w:pPr>
+        <w:rPr>
+          <w:kern w:val="16"/>
+          <w:lang w:val="en-US"/>
+        </w:rPr>
+      </w:pPr>
+      <w:r>
+        <w:rPr>
+          <w:kern w:val="16"/>
+        </w:rPr>
+        <w:t>Кернинг</w:t>
+      </w:r>
+      <w:r>
+        <w:rPr>
+          <w:kern w:val="16"/>
+        </w:rPr>
+        <w:t xml:space="preserve"> (от 8)</w:t>
+      </w:r>
+      <w:r>
+        <w:rPr>
+          <w:kern w:val="16"/>
+        </w:rPr>
+        <w:t xml:space="preserve"> </w:t>
+      </w:r>
+      <w:r>
+        <w:rPr>
+          <w:kern w:val="16"/>
+          <w:lang w:val="en-US"/>
+        </w:rPr>
+        <w:t>AVAVA</w:t>
       </w:r>
     </w:p>
     <w:p>
@@ -378,7 +522,6 @@
         </w:rPr>
         <w:t xml:space="preserve"> </w:t>
       </w:r>
-      <w:proofErr w:type="spellStart"/>
       <w:r>
         <w:rPr>
           <w:lang w:val="en-US"/>
@@ -386,7 +529,6 @@
         </w:rPr>
         <w:t>ff</w:t>
       </w:r>
-      <w:proofErr w:type="spellEnd"/>
       <w:r>
         <w:rPr>
           <w14:ligatures w14:val="all"/>
@@ -426,6 +568,7 @@
           <w:szCs w:val="36"/>
           <w:u w:val="single"/>
           <w:vertAlign w:val="superscript"/>
+          <w:lang w:val="en-US"/>
           <w14:glow w14:rad="63500">
             <w14:schemeClr w14:val="accent3">
               <w14:alpha w14:val="60000"/>
@@ -544,6 +687,8 @@
           <w:iCs/>
           <w:smallCaps/>
           <w:strike/>
+          <w:spacing w:val="100"/>
+          <w:position w:val="14"/>
           <w:sz w:val="36"/>
           <w:szCs w:val="36"/>
           <w:highlight w:val="yellow"/>
@@ -575,6 +720,8 @@
           <w:iCs/>
           <w:smallCaps/>
           <w:strike/>
+          <w:spacing w:val="100"/>
+          <w:position w:val="14"/>
           <w:sz w:val="24"/>
           <w:szCs w:val="24"/>
           <w:highlight w:val="yellow"/>
@@ -613,6 +760,8 @@
           <w:iCs/>
           <w:smallCaps/>
           <w:strike/>
+          <w:spacing w:val="100"/>
+          <w:position w:val="14"/>
           <w:sz w:val="36"/>
           <w:szCs w:val="36"/>
           <w:highlight w:val="yellow"/>
@@ -651,6 +800,7 @@
           <w:iCs/>
           <w:smallCaps/>
           <w:strike/>
+          <w:spacing w:val="100"/>
           <w:sz w:val="36"/>
           <w:szCs w:val="36"/>
           <w:highlight w:val="yellow"/>
@@ -682,6 +832,8 @@
           <w:iCs/>
           <w:caps/>
           <w:strike/>
+          <w:spacing w:val="-40"/>
+          <w:w w:val="150"/>
           <w:sz w:val="36"/>
           <w:szCs w:val="36"/>
           <w:highlight w:val="yellow"/>
@@ -714,6 +866,7 @@
           <w:caps/>
           <w:strike/>
           <w:color w:val="7030A0"/>
+          <w:w w:val="150"/>
           <w:sz w:val="36"/>
           <w:szCs w:val="36"/>
           <w:highlight w:val="yellow"/>
@@ -746,6 +899,8 @@
           <w:caps/>
           <w:strike/>
           <w:color w:val="7030A0"/>
+          <w:w w:val="150"/>
+          <w:position w:val="-12"/>
           <w:sz w:val="36"/>
           <w:szCs w:val="36"/>
           <w:highlight w:val="yellow"/>
@@ -778,6 +933,7 @@
           <w:caps/>
           <w:strike/>
           <w:color w:val="7030A0"/>
+          <w:w w:val="150"/>
           <w:sz w:val="36"/>
           <w:szCs w:val="36"/>
           <w:highlight w:val="yellow"/>
@@ -801,6 +957,40 @@
         </w:rPr>
         <w:t>но</w:t>
       </w:r>
+      <w:r>
+        <w:rPr>
+          <w:b/>
+          <w:bCs/>
+          <w:i/>
+          <w:iCs/>
+          <w:caps/>
+          <w:strike/>
+          <w:color w:val="7030A0"/>
+          <w:w w:val="150"/>
+          <w:kern w:val="36"/>
+          <w:sz w:val="36"/>
+          <w:szCs w:val="36"/>
+          <w:u w:val="single"/>
+          <w:vertAlign w:val="superscript"/>
+          <w:lang w:val="en-US"/>
+          <w14:glow w14:rad="63500">
+            <w14:schemeClr w14:val="accent3">
+              <w14:alpha w14:val="60000"/>
+              <w14:satMod w14:val="175000"/>
+            </w14:schemeClr>
+          </w14:glow>
+          <w14:shadow w14:blurRad="50800" w14:dist="38100" w14:dir="0" w14:sx="100000" w14:sy="100000" w14:kx="0" w14:ky="0" w14:algn="l">
+            <w14:srgbClr w14:val="000000">
+              <w14:alpha w14:val="60000"/>
+            </w14:srgbClr>
+          </w14:shadow>
+          <w14:reflection w14:blurRad="6350" w14:stA="55000" w14:stPos="0" w14:endA="50" w14:endPos="85000" w14:dist="29997" w14:dir="5400000" w14:fadeDir="5400000" w14:sx="100000" w14:sy="-100000" w14:kx="0" w14:ky="0" w14:algn="bl"/>
+          <w14:ligatures w14:val="all"/>
+          <w14:numForm w14:val="oldStyle"/>
+          <w14:numSpacing w14:val="tabular"/>
+        </w:rPr>
+        <w:t>vava</w:t>
+      </w:r>
     </w:p>
     <w:p>
       <w:pPr>
@@ -951,101 +1141,8 @@
         <w:t>:</w:t>
       </w:r>
       <w:r>
-        <w:t xml:space="preserve"> заполнитель </w:t>
-      </w:r>
-      <w:proofErr w:type="spellStart"/>
-      <w:r>
-        <w:t>заполнитель</w:t>
-      </w:r>
-      <w:proofErr w:type="spellEnd"/>
-      <w:r>
-        <w:t xml:space="preserve"> </w:t>
-      </w:r>
-      <w:proofErr w:type="spellStart"/>
-      <w:r>
-        <w:t>заполнитель</w:t>
-      </w:r>
-      <w:proofErr w:type="spellEnd"/>
-      <w:r>
-        <w:t xml:space="preserve"> </w:t>
-      </w:r>
-      <w:proofErr w:type="spellStart"/>
-      <w:r>
-        <w:t>заполнитель</w:t>
-      </w:r>
-      <w:proofErr w:type="spellEnd"/>
-      <w:r>
-        <w:t xml:space="preserve"> </w:t>
-      </w:r>
-      <w:proofErr w:type="spellStart"/>
-      <w:r>
-        <w:t>заполнитель</w:t>
-      </w:r>
-      <w:proofErr w:type="spellEnd"/>
-      <w:r>
-        <w:t xml:space="preserve"> </w:t>
-      </w:r>
-      <w:proofErr w:type="spellStart"/>
-      <w:r>
-        <w:t>заполнитель</w:t>
-      </w:r>
-      <w:proofErr w:type="spellEnd"/>
-      <w:r>
-        <w:t xml:space="preserve"> </w:t>
-      </w:r>
-      <w:proofErr w:type="spellStart"/>
-      <w:r>
-        <w:t>заполнитель</w:t>
-      </w:r>
-      <w:proofErr w:type="spellEnd"/>
-      <w:r>
-        <w:t xml:space="preserve"> </w:t>
-      </w:r>
-      <w:proofErr w:type="spellStart"/>
-      <w:r>
-        <w:t>заполнитель</w:t>
-      </w:r>
-      <w:proofErr w:type="spellEnd"/>
-      <w:r>
-        <w:t xml:space="preserve"> </w:t>
-      </w:r>
-      <w:proofErr w:type="spellStart"/>
-      <w:r>
-        <w:t>заполнитель</w:t>
-      </w:r>
-      <w:proofErr w:type="spellEnd"/>
-      <w:r>
-        <w:t xml:space="preserve"> </w:t>
-      </w:r>
-      <w:proofErr w:type="spellStart"/>
-      <w:r>
-        <w:t>заполнитель</w:t>
-      </w:r>
-      <w:proofErr w:type="spellEnd"/>
-      <w:r>
-        <w:t xml:space="preserve"> </w:t>
-      </w:r>
-      <w:proofErr w:type="spellStart"/>
-      <w:r>
-        <w:t>заполнитель</w:t>
-      </w:r>
-      <w:proofErr w:type="spellEnd"/>
-      <w:r>
-        <w:t xml:space="preserve"> </w:t>
-      </w:r>
-      <w:proofErr w:type="spellStart"/>
-      <w:r>
-        <w:t>заполнитель</w:t>
-      </w:r>
-      <w:proofErr w:type="spellEnd"/>
-      <w:r>
-        <w:t xml:space="preserve"> </w:t>
-      </w:r>
-      <w:proofErr w:type="spellStart"/>
-      <w:r>
-        <w:t>заполнитель</w:t>
-      </w:r>
-      <w:proofErr w:type="spellEnd"/>
+        <w:t xml:space="preserve"> заполнитель заполнитель заполнитель заполнитель заполнитель заполнитель заполнитель заполнитель заполнитель заполнитель заполнитель заполнитель заполнитель</w:t>
+      </w:r>
     </w:p>
     <w:p>
       <w:pPr>
@@ -2913,7 +3010,6 @@
         <w:spacing w:line="259" w:lineRule="auto"/>
       </w:pPr>
       <w:hyperlink r:id="rId8" w:history="1">
-        <w:proofErr w:type="spellStart"/>
         <w:r>
           <w:rPr>
             <w:rStyle w:val="af8"/>
@@ -2921,7 +3017,6 @@
           </w:rPr>
           <w:t>abc</w:t>
         </w:r>
-        <w:proofErr w:type="spellEnd"/>
         <w:r>
           <w:rPr>
             <w:rStyle w:val="af8"/>
@@ -10847,7 +10942,7 @@
         <v:path o:extrusionok="f" gradientshapeok="t" o:connecttype="rect"/>
         <o:lock v:ext="edit" aspectratio="t"/>
       </v:shapetype>
-      <v:shape id="_x0000_i1029" type="#_x0000_t75" style="width:331.8pt;height:225.8pt" o:bullet="t">
+      <v:shape id="_x0000_i1036" type="#_x0000_t75" style="width:331.8pt;height:225.8pt" o:bullet="t">
         <v:imagedata r:id="rId1" o:title="Снимок экрана 2023-08-08 135539"/>
       </v:shape>
     </w:pict>
@@ -14698,7 +14793,7 @@
 </file>
 
 <file path=customXml/itemProps1.xml><?xml version="1.0" encoding="utf-8"?>
-<ds:datastoreItem xmlns:ds="http://schemas.openxmlformats.org/officeDocument/2006/customXml" ds:itemID="{E536CAD6-4A7B-41F6-9282-15C8E4A2D300}">
+<ds:datastoreItem xmlns:ds="http://schemas.openxmlformats.org/officeDocument/2006/customXml" ds:itemID="{4B21716C-0933-4CB1-9AE3-A02497BD874E}">
   <ds:schemaRefs>
     <ds:schemaRef ds:uri="http://schemas.openxmlformats.org/officeDocument/2006/bibliography"/>
   </ds:schemaRefs>

</xml_diff>

<commit_message>
Add text scale for transform (future browser versions)
</commit_message>
<xml_diff>
--- a/tests/examples/content_check.docx
+++ b/tests/examples/content_check.docx
@@ -234,94 +234,101 @@
         </w:rPr>
         <w:t xml:space="preserve"> (20пт)</w:t>
       </w:r>
+    </w:p>
+    <w:p>
+      <w:r>
+        <w:rPr>
+          <w:rFonts w:ascii="Calibri" w:hAnsi="Calibri" w:cs="Calibri"/>
+        </w:rPr>
+        <w:t>Другой</w:t>
+      </w:r>
+      <w:r>
+        <w:rPr>
+          <w:rFonts w:ascii="Algerian" w:hAnsi="Algerian"/>
+        </w:rPr>
+        <w:t xml:space="preserve"> </w:t>
+      </w:r>
+      <w:r>
+        <w:rPr>
+          <w:rFonts w:ascii="Calibri" w:hAnsi="Calibri" w:cs="Calibri"/>
+        </w:rPr>
+        <w:t>шрифт</w:t>
+      </w:r>
+      <w:r>
+        <w:rPr>
+          <w:rFonts w:ascii="Algerian" w:hAnsi="Algerian"/>
+        </w:rPr>
+        <w:t xml:space="preserve"> (</w:t>
+      </w:r>
+      <w:r>
+        <w:rPr>
+          <w:rFonts w:ascii="Algerian" w:hAnsi="Algerian"/>
+          <w:lang w:val="en-US"/>
+        </w:rPr>
+        <w:t>ALEGRIAN</w:t>
+      </w:r>
+      <w:r>
+        <w:rPr>
+          <w:rFonts w:ascii="Algerian" w:hAnsi="Algerian"/>
+        </w:rPr>
+        <w:t>)</w:t>
+      </w:r>
+    </w:p>
+    <w:p>
+      <w:r>
+        <w:rPr>
+          <w:highlight w:val="cyan"/>
+        </w:rPr>
+        <w:t>Выделение текста</w:t>
+      </w:r>
+      <w:r>
+        <w:rPr>
+          <w:highlight w:val="cyan"/>
+        </w:rPr>
+        <w:t xml:space="preserve"> (</w:t>
+      </w:r>
+      <w:r>
+        <w:rPr>
+          <w:highlight w:val="cyan"/>
+        </w:rPr>
+        <w:t>голубой)</w:t>
+      </w:r>
       <w:bookmarkStart w:id="0" w:name="_GoBack"/>
       <w:bookmarkEnd w:id="0"/>
     </w:p>
     <w:p>
-      <w:r>
-        <w:rPr>
-          <w:rFonts w:ascii="Calibri" w:hAnsi="Calibri" w:cs="Calibri"/>
-        </w:rPr>
-        <w:t>Другой</w:t>
-      </w:r>
-      <w:r>
-        <w:rPr>
-          <w:rFonts w:ascii="Algerian" w:hAnsi="Algerian"/>
-        </w:rPr>
-        <w:t xml:space="preserve"> </w:t>
-      </w:r>
-      <w:r>
-        <w:rPr>
-          <w:rFonts w:ascii="Calibri" w:hAnsi="Calibri" w:cs="Calibri"/>
-        </w:rPr>
-        <w:t>шрифт</w:t>
-      </w:r>
-      <w:r>
-        <w:rPr>
-          <w:rFonts w:ascii="Algerian" w:hAnsi="Algerian"/>
-        </w:rPr>
-        <w:t xml:space="preserve"> (</w:t>
-      </w:r>
-      <w:r>
-        <w:rPr>
-          <w:rFonts w:ascii="Algerian" w:hAnsi="Algerian"/>
-          <w:lang w:val="en-US"/>
-        </w:rPr>
-        <w:t>ALEGRIAN</w:t>
-      </w:r>
-      <w:r>
-        <w:rPr>
-          <w:rFonts w:ascii="Algerian" w:hAnsi="Algerian"/>
-        </w:rPr>
-        <w:t>)</w:t>
-      </w:r>
-    </w:p>
-    <w:p>
-      <w:r>
-        <w:rPr>
-          <w:highlight w:val="cyan"/>
-        </w:rPr>
-        <w:t>Выделение текста</w:t>
-      </w:r>
-      <w:r>
-        <w:rPr>
-          <w:highlight w:val="cyan"/>
-          <w:lang w:val="en-US"/>
-        </w:rPr>
-        <w:t xml:space="preserve"> (</w:t>
-      </w:r>
-      <w:r>
-        <w:rPr>
-          <w:highlight w:val="cyan"/>
-        </w:rPr>
-        <w:t>голубой)</w:t>
-      </w:r>
-    </w:p>
-    <w:p>
-      <w:pPr>
+      <w:pPr>
+        <w:rPr>
+          <w:w w:val="200"/>
+        </w:rPr>
+      </w:pPr>
+      <w:r>
+        <w:rPr>
+          <w:w w:val="200"/>
+        </w:rPr>
+        <w:t>Масштаб</w:t>
+      </w:r>
+      <w:r>
+        <w:rPr>
+          <w:w w:val="200"/>
+        </w:rPr>
+        <w:t xml:space="preserve"> 2</w:t>
+      </w:r>
+      <w:r>
+        <w:rPr>
+          <w:w w:val="200"/>
+        </w:rPr>
+        <w:t>00 %</w:t>
+      </w:r>
+      <w:r>
         <w:rPr>
           <w:w w:val="200"/>
           <w:lang w:val="en-US"/>
         </w:rPr>
-      </w:pPr>
-      <w:r>
-        <w:rPr>
-          <w:w w:val="200"/>
-        </w:rPr>
-        <w:t>Масштаб</w:t>
-      </w:r>
-      <w:r>
-        <w:rPr>
-          <w:w w:val="200"/>
-        </w:rPr>
-        <w:t xml:space="preserve"> 2</w:t>
-      </w:r>
-      <w:r>
-        <w:rPr>
-          <w:w w:val="200"/>
-          <w:lang w:val="en-US"/>
-        </w:rPr>
-        <w:t>00 %</w:t>
+        <w:t xml:space="preserve"> </w:t>
+      </w:r>
+      <w:r>
+        <w:t>Обычный</w:t>
       </w:r>
     </w:p>
     <w:p>
@@ -392,7 +399,6 @@
       <w:pPr>
         <w:rPr>
           <w:kern w:val="16"/>
-          <w:lang w:val="en-US"/>
         </w:rPr>
       </w:pPr>
       <w:r>
@@ -522,6 +528,7 @@
         </w:rPr>
         <w:t xml:space="preserve"> </w:t>
       </w:r>
+      <w:proofErr w:type="spellStart"/>
       <w:r>
         <w:rPr>
           <w:lang w:val="en-US"/>
@@ -529,6 +536,7 @@
         </w:rPr>
         <w:t>ff</w:t>
       </w:r>
+      <w:proofErr w:type="spellEnd"/>
       <w:r>
         <w:rPr>
           <w14:ligatures w14:val="all"/>
@@ -568,7 +576,6 @@
           <w:szCs w:val="36"/>
           <w:u w:val="single"/>
           <w:vertAlign w:val="superscript"/>
-          <w:lang w:val="en-US"/>
           <w14:glow w14:rad="63500">
             <w14:schemeClr w14:val="accent3">
               <w14:alpha w14:val="60000"/>
@@ -792,6 +799,7 @@
         </w:rPr>
         <w:t>п</w:t>
       </w:r>
+      <w:proofErr w:type="spellStart"/>
       <w:r>
         <w:rPr>
           <w:b/>
@@ -890,6 +898,7 @@
         </w:rPr>
         <w:t>с</w:t>
       </w:r>
+      <w:proofErr w:type="spellEnd"/>
       <w:r>
         <w:rPr>
           <w:b/>
@@ -1141,8 +1150,101 @@
         <w:t>:</w:t>
       </w:r>
       <w:r>
-        <w:t xml:space="preserve"> заполнитель заполнитель заполнитель заполнитель заполнитель заполнитель заполнитель заполнитель заполнитель заполнитель заполнитель заполнитель заполнитель</w:t>
-      </w:r>
+        <w:t xml:space="preserve"> заполнитель </w:t>
+      </w:r>
+      <w:proofErr w:type="spellStart"/>
+      <w:r>
+        <w:t>заполнитель</w:t>
+      </w:r>
+      <w:proofErr w:type="spellEnd"/>
+      <w:r>
+        <w:t xml:space="preserve"> </w:t>
+      </w:r>
+      <w:proofErr w:type="spellStart"/>
+      <w:r>
+        <w:t>заполнитель</w:t>
+      </w:r>
+      <w:proofErr w:type="spellEnd"/>
+      <w:r>
+        <w:t xml:space="preserve"> </w:t>
+      </w:r>
+      <w:proofErr w:type="spellStart"/>
+      <w:r>
+        <w:t>заполнитель</w:t>
+      </w:r>
+      <w:proofErr w:type="spellEnd"/>
+      <w:r>
+        <w:t xml:space="preserve"> </w:t>
+      </w:r>
+      <w:proofErr w:type="spellStart"/>
+      <w:r>
+        <w:t>заполнитель</w:t>
+      </w:r>
+      <w:proofErr w:type="spellEnd"/>
+      <w:r>
+        <w:t xml:space="preserve"> </w:t>
+      </w:r>
+      <w:proofErr w:type="spellStart"/>
+      <w:r>
+        <w:t>заполнитель</w:t>
+      </w:r>
+      <w:proofErr w:type="spellEnd"/>
+      <w:r>
+        <w:t xml:space="preserve"> </w:t>
+      </w:r>
+      <w:proofErr w:type="spellStart"/>
+      <w:r>
+        <w:t>заполнитель</w:t>
+      </w:r>
+      <w:proofErr w:type="spellEnd"/>
+      <w:r>
+        <w:t xml:space="preserve"> </w:t>
+      </w:r>
+      <w:proofErr w:type="spellStart"/>
+      <w:r>
+        <w:t>заполнитель</w:t>
+      </w:r>
+      <w:proofErr w:type="spellEnd"/>
+      <w:r>
+        <w:t xml:space="preserve"> </w:t>
+      </w:r>
+      <w:proofErr w:type="spellStart"/>
+      <w:r>
+        <w:t>заполнитель</w:t>
+      </w:r>
+      <w:proofErr w:type="spellEnd"/>
+      <w:r>
+        <w:t xml:space="preserve"> </w:t>
+      </w:r>
+      <w:proofErr w:type="spellStart"/>
+      <w:r>
+        <w:t>заполнитель</w:t>
+      </w:r>
+      <w:proofErr w:type="spellEnd"/>
+      <w:r>
+        <w:t xml:space="preserve"> </w:t>
+      </w:r>
+      <w:proofErr w:type="spellStart"/>
+      <w:r>
+        <w:t>заполнитель</w:t>
+      </w:r>
+      <w:proofErr w:type="spellEnd"/>
+      <w:r>
+        <w:t xml:space="preserve"> </w:t>
+      </w:r>
+      <w:proofErr w:type="spellStart"/>
+      <w:r>
+        <w:t>заполнитель</w:t>
+      </w:r>
+      <w:proofErr w:type="spellEnd"/>
+      <w:r>
+        <w:t xml:space="preserve"> </w:t>
+      </w:r>
+      <w:proofErr w:type="spellStart"/>
+      <w:r>
+        <w:t>заполнитель</w:t>
+      </w:r>
+      <w:proofErr w:type="spellEnd"/>
     </w:p>
     <w:p>
       <w:pPr>
@@ -3010,6 +3112,7 @@
         <w:spacing w:line="259" w:lineRule="auto"/>
       </w:pPr>
       <w:hyperlink r:id="rId8" w:history="1">
+        <w:proofErr w:type="spellStart"/>
         <w:r>
           <w:rPr>
             <w:rStyle w:val="af8"/>
@@ -3017,6 +3120,7 @@
           </w:rPr>
           <w:t>abc</w:t>
         </w:r>
+        <w:proofErr w:type="spellEnd"/>
         <w:r>
           <w:rPr>
             <w:rStyle w:val="af8"/>
@@ -10942,7 +11046,7 @@
         <v:path o:extrusionok="f" gradientshapeok="t" o:connecttype="rect"/>
         <o:lock v:ext="edit" aspectratio="t"/>
       </v:shapetype>
-      <v:shape id="_x0000_i1036" type="#_x0000_t75" style="width:331.8pt;height:225.8pt" o:bullet="t">
+      <v:shape id="_x0000_i1027" type="#_x0000_t75" style="width:331.8pt;height:225.8pt" o:bullet="t">
         <v:imagedata r:id="rId1" o:title="Снимок экрана 2023-08-08 135539"/>
       </v:shape>
     </w:pict>
@@ -14793,7 +14897,7 @@
 </file>
 
 <file path=customXml/itemProps1.xml><?xml version="1.0" encoding="utf-8"?>
-<ds:datastoreItem xmlns:ds="http://schemas.openxmlformats.org/officeDocument/2006/customXml" ds:itemID="{4B21716C-0933-4CB1-9AE3-A02497BD874E}">
+<ds:datastoreItem xmlns:ds="http://schemas.openxmlformats.org/officeDocument/2006/customXml" ds:itemID="{5263073D-53D9-4F73-966F-AB1C2C9EB660}">
   <ds:schemaRefs>
     <ds:schemaRef ds:uri="http://schemas.openxmlformats.org/officeDocument/2006/bibliography"/>
   </ds:schemaRefs>

</xml_diff>